<commit_message>
Replace GitHub/Slack MCP with GitLab MCP
Update CLAUDE.md and onboarding doc to reference GitLab MCP server
(https://gitlab.com/api/v4/mcp, requires GITLAB_PERSONAL_ACCESS_TOKEN).

Co-Authored-By: Claude Sonnet 4.6 <noreply@anthropic.com>
</commit_message>
<xml_diff>
--- a/ON24 Claude Code Onboarding Guide.docx
+++ b/ON24 Claude Code Onboarding Guide.docx
@@ -963,7 +963,13 @@
         <w:pStyle w:val="ListBullet"/>
       </w:pPr>
       <w:r>
-        <w:t>Anthropic API key set: export ANTHROPIC_API_KEY=sk-ant-...</w:t>
+        <w:t>Anthropic API key set</w:t>
+      </w:r>
+      <w:r>
+        <w:t xml:space="preserve"> (if you have a login from ON24, you can skip this)</w:t>
+      </w:r>
+      <w:r>
+        <w:t>: export ANTHROPIC_API_KEY=sk-ant-...</w:t>
       </w:r>
     </w:p>
     <w:p>
@@ -1201,6 +1207,7 @@
     </w:p>
     <w:p>
       <w:r>
+        <w:lastRenderedPageBreak/>
         <w:t>You should see Claude start. Type: 'what skills do you have?' and confirm prd and adr appear in the list.</w:t>
       </w:r>
     </w:p>
@@ -1536,7 +1543,7 @@
     </w:p>
     <w:p>
       <w:r>
-        <w:t>MCP (Model Context Protocol) servers give Claude real-time access to external tools. Two are pre-configured in CLAUDE.md:</w:t>
+        <w:t>MCP (Model Context Protocol) servers give Claude real-time access to external tools. One is pre-configured in CLAUDE.md:</w:t>
       </w:r>
     </w:p>
     <w:p>
@@ -1544,21 +1551,14 @@
         <w:pStyle w:val="ListBullet"/>
       </w:pPr>
       <w:r>
-        <w:t>GitHub MCP — Claude can read issues, PRs, and repo data. Requires GITHUB_PERSONAL_ACCESS_TOKEN env var.</w:t>
-      </w:r>
-    </w:p>
-    <w:p>
-      <w:pPr>
-        <w:pStyle w:val="ListBullet"/>
-      </w:pPr>
-      <w:r>
-        <w:lastRenderedPageBreak/>
-        <w:t>Slack MCP — Claude can read/send Slack messages. OAuth flow (see IT for client credentials).</w:t>
+        <w:t>GitLab MCP — Claude can read/write issues, merge requests, pipelines, and repo data. Requires GITLAB_PERSONAL_ACCESS_TOKEN env var.</w:t>
       </w:r>
     </w:p>
     <w:p>
       <w:r>
         <w:t>Add MCP servers via: Settings &gt; MCP Servers in the Claude Code UI, or claude mcp add.</w:t>
+        <w:br/>
+        <w:t>Setup: export GITLAB_PERSONAL_ACCESS_TOKEN=&lt;your-token&gt; then add the server with url https://gitlab.com/api/v4/mcp.</w:t>
       </w:r>
     </w:p>
     <w:p/>
@@ -1960,7 +1960,13 @@
         <w:pStyle w:val="ListBullet"/>
       </w:pPr>
       <w:r>
-        <w:t>✅  Let Claude commit. The commit cadence in CLAUDE.md (every logical chunk) keeps history clean and bisectable.</w:t>
+        <w:t>✅  Let Claude commit. The</w:t>
+      </w:r>
+      <w:r>
+        <w:t xml:space="preserve"> automated</w:t>
+      </w:r>
+      <w:r>
+        <w:t xml:space="preserve"> commit cadence in CLAUDE.md (every logical chunk) keeps history clean and bisectable.</w:t>
       </w:r>
     </w:p>
     <w:p>

</xml_diff>

<commit_message>
Add example-ai/ reference templates for repo memory
Six annotated example .ai/ files (project, architecture, commands,
tasks, decisions + README) showing the expected format and depth.
Engineers copy to their repo root as .ai/ and fill in the blanks —
or ask Claude to populate from the codebase.

Co-Authored-By: Claude Sonnet 4.6 <noreply@anthropic.com>
</commit_message>
<xml_diff>
--- a/ON24 Claude Code Onboarding Guide.docx
+++ b/ON24 Claude Code Onboarding Guide.docx
@@ -112,13 +112,34 @@
     </w:p>
     <w:p>
       <w:r>
-        <w:t>Claude Code is Anthropic's AI coding assistant. Out of the box it works, but it starts with zero knowledge of your team, your stack, your standards, or how you expect it to behave. Every engineer configures it differently — or not at all. The result: inconsistent output, repeated corrections, and missed best practices.</w:t>
+        <w:t xml:space="preserve">Claude Code is </w:t>
+      </w:r>
+      <w:proofErr w:type="spellStart"/>
+      <w:r>
+        <w:t>Anthropic's</w:t>
+      </w:r>
+      <w:proofErr w:type="spellEnd"/>
+      <w:r>
+        <w:t xml:space="preserve"> AI coding assistant. Out of the box it works, but it starts with zero knowledge of your team, your stack, your standards, or how you expect it to behave. Every engineer configures it differently — or not at all. The result: inconsistent output, repeated corrections, and missed best practices.</w:t>
       </w:r>
     </w:p>
     <w:p/>
     <w:p>
       <w:r>
-        <w:t>This template solves that. It is a pre-configured ~/.claude directory that encodes ON24's engineering standards directly into every Claude session, from day one. The difference is not subtle:</w:t>
+        <w:t>This template solves that. It is a pre-configured ~</w:t>
+      </w:r>
+      <w:proofErr w:type="gramStart"/>
+      <w:r>
+        <w:t>/.</w:t>
+      </w:r>
+      <w:proofErr w:type="spellStart"/>
+      <w:r>
+        <w:t>claude</w:t>
+      </w:r>
+      <w:proofErr w:type="spellEnd"/>
+      <w:proofErr w:type="gramEnd"/>
+      <w:r>
+        <w:t xml:space="preserve"> directory that encodes ON24's engineering standards directly into every Claude session, from day one. The difference is not subtle:</w:t>
       </w:r>
     </w:p>
     <w:p/>
@@ -171,7 +192,23 @@
           </w:tcPr>
           <w:p>
             <w:r>
-              <w:t>Asks permission for every git, npm, and test command</w:t>
+              <w:t xml:space="preserve">Asks permission for every </w:t>
+            </w:r>
+            <w:proofErr w:type="gramStart"/>
+            <w:r>
+              <w:t>git</w:t>
+            </w:r>
+            <w:proofErr w:type="gramEnd"/>
+            <w:r>
+              <w:t xml:space="preserve">, </w:t>
+            </w:r>
+            <w:proofErr w:type="spellStart"/>
+            <w:r>
+              <w:t>npm</w:t>
+            </w:r>
+            <w:proofErr w:type="spellEnd"/>
+            <w:r>
+              <w:t>, and test command</w:t>
             </w:r>
           </w:p>
         </w:tc>
@@ -258,7 +295,6 @@
             <w:tcW w:w="4392" w:type="dxa"/>
           </w:tcPr>
           <w:p>
-            <w:r/>
             <w:r>
               <w:t>Context lost between sessions — .ai/ needs manual setup per repo</w:t>
             </w:r>
@@ -269,7 +305,6 @@
             <w:tcW w:w="4392" w:type="dxa"/>
           </w:tcPr>
           <w:p>
-            <w:r/>
             <w:r>
               <w:t>.ai/ auto-created and populated on first use; tasks.md synced every 20 min — zero manual setup</w:t>
             </w:r>
@@ -283,7 +318,15 @@
           </w:tcPr>
           <w:p>
             <w:r>
-              <w:t>No guardrails — will read .env, commit credentials</w:t>
+              <w:t xml:space="preserve">No guardrails — will </w:t>
+            </w:r>
+            <w:proofErr w:type="gramStart"/>
+            <w:r>
+              <w:t>read .env</w:t>
+            </w:r>
+            <w:proofErr w:type="gramEnd"/>
+            <w:r>
+              <w:t>, commit credentials</w:t>
             </w:r>
           </w:p>
         </w:tc>
@@ -354,10 +397,22 @@
           <w:b/>
           <w:color w:val="0047AB"/>
         </w:rPr>
-        <w:t xml:space="preserve">KEY INSIGHT  </w:t>
-      </w:r>
-      <w:r>
-        <w:t>The cumulative effect: engineers spend less time correcting Claude, more time reviewing output. Features arrive with PRDs. Decisions get documented. Code passes a mental 'staff engineer' bar before it's called done.</w:t>
+        <w:t xml:space="preserve">KEY </w:t>
+      </w:r>
+      <w:proofErr w:type="gramStart"/>
+      <w:r>
+        <w:rPr>
+          <w:b/>
+          <w:color w:val="0047AB"/>
+        </w:rPr>
+        <w:t xml:space="preserve">INSIGHT  </w:t>
+      </w:r>
+      <w:r>
+        <w:t>The</w:t>
+      </w:r>
+      <w:proofErr w:type="gramEnd"/>
+      <w:r>
+        <w:t xml:space="preserve"> cumulative effect: engineers spend less time correcting Claude, more time reviewing output. Features arrive with PRDs. Decisions get documented. Code passes a mental 'staff engineer' bar before it's called done.</w:t>
       </w:r>
     </w:p>
     <w:p/>
@@ -402,13 +457,33 @@
         <w:spacing w:before="40" w:after="40"/>
         <w:ind w:left="576"/>
       </w:pPr>
+      <w:proofErr w:type="gramStart"/>
       <w:r>
         <w:rPr>
           <w:rFonts w:ascii="Courier New" w:hAnsi="Courier New"/>
           <w:color w:val="24292F"/>
           <w:sz w:val="18"/>
         </w:rPr>
-        <w:t>.claude/</w:t>
+        <w:t>.</w:t>
+      </w:r>
+      <w:proofErr w:type="spellStart"/>
+      <w:r>
+        <w:rPr>
+          <w:rFonts w:ascii="Courier New" w:hAnsi="Courier New"/>
+          <w:color w:val="24292F"/>
+          <w:sz w:val="18"/>
+        </w:rPr>
+        <w:t>claude</w:t>
+      </w:r>
+      <w:proofErr w:type="spellEnd"/>
+      <w:proofErr w:type="gramEnd"/>
+      <w:r>
+        <w:rPr>
+          <w:rFonts w:ascii="Courier New" w:hAnsi="Courier New"/>
+          <w:color w:val="24292F"/>
+          <w:sz w:val="18"/>
+        </w:rPr>
+        <w:t>/</w:t>
       </w:r>
     </w:p>
     <w:p>
@@ -438,7 +513,27 @@
           <w:color w:val="24292F"/>
           <w:sz w:val="18"/>
         </w:rPr>
-        <w:t>├── settings.json               ← Permissions, plugins, output style</w:t>
+        <w:t xml:space="preserve">├── </w:t>
+      </w:r>
+      <w:proofErr w:type="spellStart"/>
+      <w:proofErr w:type="gramStart"/>
+      <w:r>
+        <w:rPr>
+          <w:rFonts w:ascii="Courier New" w:hAnsi="Courier New"/>
+          <w:color w:val="24292F"/>
+          <w:sz w:val="18"/>
+        </w:rPr>
+        <w:t>settings.json</w:t>
+      </w:r>
+      <w:proofErr w:type="spellEnd"/>
+      <w:proofErr w:type="gramEnd"/>
+      <w:r>
+        <w:rPr>
+          <w:rFonts w:ascii="Courier New" w:hAnsi="Courier New"/>
+          <w:color w:val="24292F"/>
+          <w:sz w:val="18"/>
+        </w:rPr>
+        <w:t xml:space="preserve">               ← Permissions, plugins, output style</w:t>
       </w:r>
     </w:p>
     <w:p>
@@ -453,7 +548,45 @@
           <w:color w:val="24292F"/>
           <w:sz w:val="18"/>
         </w:rPr>
-        <w:t>├── policy-limits.json          ← Security: disables remote control</w:t>
+        <w:t>├── policy-</w:t>
+      </w:r>
+      <w:proofErr w:type="spellStart"/>
+      <w:proofErr w:type="gramStart"/>
+      <w:r>
+        <w:rPr>
+          <w:rFonts w:ascii="Courier New" w:hAnsi="Courier New"/>
+          <w:color w:val="24292F"/>
+          <w:sz w:val="18"/>
+        </w:rPr>
+        <w:t>limits.json</w:t>
+      </w:r>
+      <w:proofErr w:type="spellEnd"/>
+      <w:proofErr w:type="gramEnd"/>
+      <w:r>
+        <w:rPr>
+          <w:rFonts w:ascii="Courier New" w:hAnsi="Courier New"/>
+          <w:color w:val="24292F"/>
+          <w:sz w:val="18"/>
+        </w:rPr>
+        <w:t xml:space="preserve">          ← </w:t>
+      </w:r>
+      <w:proofErr w:type="gramStart"/>
+      <w:r>
+        <w:rPr>
+          <w:rFonts w:ascii="Courier New" w:hAnsi="Courier New"/>
+          <w:color w:val="24292F"/>
+          <w:sz w:val="18"/>
+        </w:rPr>
+        <w:t>Security:</w:t>
+      </w:r>
+      <w:proofErr w:type="gramEnd"/>
+      <w:r>
+        <w:rPr>
+          <w:rFonts w:ascii="Courier New" w:hAnsi="Courier New"/>
+          <w:color w:val="24292F"/>
+          <w:sz w:val="18"/>
+        </w:rPr>
+        <w:t xml:space="preserve"> disables remote control</w:t>
       </w:r>
     </w:p>
     <w:p>
@@ -468,7 +601,35 @@
           <w:color w:val="24292F"/>
           <w:sz w:val="18"/>
         </w:rPr>
-        <w:t>├── .gitignore                  ← Excludes ephemeral files from git</w:t>
+        <w:t>├─</w:t>
+      </w:r>
+      <w:proofErr w:type="gramStart"/>
+      <w:r>
+        <w:rPr>
+          <w:rFonts w:ascii="Courier New" w:hAnsi="Courier New"/>
+          <w:color w:val="24292F"/>
+          <w:sz w:val="18"/>
+        </w:rPr>
+        <w:t>─ .</w:t>
+      </w:r>
+      <w:proofErr w:type="spellStart"/>
+      <w:r>
+        <w:rPr>
+          <w:rFonts w:ascii="Courier New" w:hAnsi="Courier New"/>
+          <w:color w:val="24292F"/>
+          <w:sz w:val="18"/>
+        </w:rPr>
+        <w:t>gitignore</w:t>
+      </w:r>
+      <w:proofErr w:type="spellEnd"/>
+      <w:proofErr w:type="gramEnd"/>
+      <w:r>
+        <w:rPr>
+          <w:rFonts w:ascii="Courier New" w:hAnsi="Courier New"/>
+          <w:color w:val="24292F"/>
+          <w:sz w:val="18"/>
+        </w:rPr>
+        <w:t xml:space="preserve">                  ← Excludes ephemeral files from git</w:t>
       </w:r>
     </w:p>
     <w:p>
@@ -513,7 +674,25 @@
           <w:color w:val="24292F"/>
           <w:sz w:val="18"/>
         </w:rPr>
-        <w:t>│   ├── prd.md                  ← /prd slash command</w:t>
+        <w:t>│   ├── prd.md                  ← /</w:t>
+      </w:r>
+      <w:proofErr w:type="spellStart"/>
+      <w:r>
+        <w:rPr>
+          <w:rFonts w:ascii="Courier New" w:hAnsi="Courier New"/>
+          <w:color w:val="24292F"/>
+          <w:sz w:val="18"/>
+        </w:rPr>
+        <w:t>prd</w:t>
+      </w:r>
+      <w:proofErr w:type="spellEnd"/>
+      <w:r>
+        <w:rPr>
+          <w:rFonts w:ascii="Courier New" w:hAnsi="Courier New"/>
+          <w:color w:val="24292F"/>
+          <w:sz w:val="18"/>
+        </w:rPr>
+        <w:t xml:space="preserve"> slash command</w:t>
       </w:r>
     </w:p>
     <w:p>
@@ -581,7 +760,6 @@
         <w:shd w:val="clear" w:color="auto" w:fill="F3F4F6"/>
         <w:spacing w:before="40" w:after="40"/>
         <w:ind w:left="576"/>
-        <w:shd w:val="clear" w:color="auto" w:fill="F3F4F6"/>
       </w:pPr>
       <w:r>
         <w:rPr>
@@ -589,14 +767,43 @@
           <w:color w:val="24292F"/>
           <w:sz w:val="18"/>
         </w:rPr>
-      </w:r>
+        <w:t xml:space="preserve">└── hooks-handlers/init-ai.sh     ← </w:t>
+      </w:r>
+      <w:proofErr w:type="spellStart"/>
       <w:r>
         <w:rPr>
           <w:rFonts w:ascii="Courier New" w:hAnsi="Courier New"/>
           <w:color w:val="24292F"/>
           <w:sz w:val="18"/>
         </w:rPr>
-        <w:t>└── hooks-handlers/init-ai.sh     ← SessionStart hook: auto-init .ai/ + tasks sync</w:t>
+        <w:t>SessionStart</w:t>
+      </w:r>
+      <w:proofErr w:type="spellEnd"/>
+      <w:r>
+        <w:rPr>
+          <w:rFonts w:ascii="Courier New" w:hAnsi="Courier New"/>
+          <w:color w:val="24292F"/>
+          <w:sz w:val="18"/>
+        </w:rPr>
+        <w:t xml:space="preserve"> hook: auto-</w:t>
+      </w:r>
+      <w:proofErr w:type="spellStart"/>
+      <w:r>
+        <w:rPr>
+          <w:rFonts w:ascii="Courier New" w:hAnsi="Courier New"/>
+          <w:color w:val="24292F"/>
+          <w:sz w:val="18"/>
+        </w:rPr>
+        <w:t>init</w:t>
+      </w:r>
+      <w:proofErr w:type="spellEnd"/>
+      <w:r>
+        <w:rPr>
+          <w:rFonts w:ascii="Courier New" w:hAnsi="Courier New"/>
+          <w:color w:val="24292F"/>
+          <w:sz w:val="18"/>
+        </w:rPr>
+        <w:t xml:space="preserve"> .ai/ + tasks sync</w:t>
       </w:r>
     </w:p>
     <w:p>
@@ -626,8 +833,20 @@
           <w:color w:val="24292F"/>
           <w:sz w:val="18"/>
         </w:rPr>
-        <w:t xml:space="preserve">    ├── blocklist.json</w:t>
-      </w:r>
+        <w:t xml:space="preserve">    ├── </w:t>
+      </w:r>
+      <w:proofErr w:type="spellStart"/>
+      <w:proofErr w:type="gramStart"/>
+      <w:r>
+        <w:rPr>
+          <w:rFonts w:ascii="Courier New" w:hAnsi="Courier New"/>
+          <w:color w:val="24292F"/>
+          <w:sz w:val="18"/>
+        </w:rPr>
+        <w:t>blocklist.json</w:t>
+      </w:r>
+      <w:proofErr w:type="spellEnd"/>
+      <w:proofErr w:type="gramEnd"/>
     </w:p>
     <w:p>
       <w:pPr>
@@ -641,8 +860,28 @@
           <w:color w:val="24292F"/>
           <w:sz w:val="18"/>
         </w:rPr>
-        <w:t xml:space="preserve">    └── known_marketplaces.json</w:t>
-      </w:r>
+        <w:t xml:space="preserve">    └── </w:t>
+      </w:r>
+      <w:proofErr w:type="spellStart"/>
+      <w:r>
+        <w:rPr>
+          <w:rFonts w:ascii="Courier New" w:hAnsi="Courier New"/>
+          <w:color w:val="24292F"/>
+          <w:sz w:val="18"/>
+        </w:rPr>
+        <w:t>known_</w:t>
+      </w:r>
+      <w:proofErr w:type="gramStart"/>
+      <w:r>
+        <w:rPr>
+          <w:rFonts w:ascii="Courier New" w:hAnsi="Courier New"/>
+          <w:color w:val="24292F"/>
+          <w:sz w:val="18"/>
+        </w:rPr>
+        <w:t>marketplaces.json</w:t>
+      </w:r>
+      <w:proofErr w:type="spellEnd"/>
+      <w:proofErr w:type="gramEnd"/>
     </w:p>
     <w:p/>
     <w:p>
@@ -880,9 +1119,11 @@
             <w:tcW w:w="2928" w:type="dxa"/>
           </w:tcPr>
           <w:p>
+            <w:proofErr w:type="spellStart"/>
             <w:r>
               <w:t>prd</w:t>
             </w:r>
+            <w:proofErr w:type="spellEnd"/>
           </w:p>
         </w:tc>
         <w:tc>
@@ -891,8 +1132,15 @@
           </w:tcPr>
           <w:p>
             <w:r>
-              <w:t>/prd</w:t>
+              <w:t>/</w:t>
             </w:r>
+            <w:proofErr w:type="spellStart"/>
+            <w:proofErr w:type="gramStart"/>
+            <w:r>
+              <w:t>prd</w:t>
+            </w:r>
+            <w:proofErr w:type="spellEnd"/>
+            <w:proofErr w:type="gramEnd"/>
           </w:p>
         </w:tc>
         <w:tc>
@@ -912,9 +1160,11 @@
             <w:tcW w:w="2928" w:type="dxa"/>
           </w:tcPr>
           <w:p>
+            <w:proofErr w:type="spellStart"/>
             <w:r>
               <w:t>adr</w:t>
             </w:r>
+            <w:proofErr w:type="spellEnd"/>
           </w:p>
         </w:tc>
         <w:tc>
@@ -933,7 +1183,27 @@
           </w:tcPr>
           <w:p>
             <w:r>
-              <w:t>Architecture Decision Records — enumerates options, evaluates tradeoffs, appends to .ai/decisions.md.</w:t>
+              <w:t xml:space="preserve">Architecture Decision Records — enumerates </w:t>
+            </w:r>
+            <w:r>
+              <w:lastRenderedPageBreak/>
+              <w:t xml:space="preserve">options, </w:t>
+            </w:r>
+            <w:proofErr w:type="gramStart"/>
+            <w:r>
+              <w:t>evaluates</w:t>
+            </w:r>
+            <w:proofErr w:type="gramEnd"/>
+            <w:r>
+              <w:t xml:space="preserve"> tradeoffs, appends </w:t>
+            </w:r>
+            <w:proofErr w:type="gramStart"/>
+            <w:r>
+              <w:t>to .</w:t>
+            </w:r>
+            <w:proofErr w:type="gramEnd"/>
+            <w:r>
+              <w:t>ai/decisions.md.</w:t>
             </w:r>
           </w:p>
         </w:tc>
@@ -941,27 +1211,41 @@
       <w:tr>
         <w:tc>
           <w:tcPr>
-            <w:tcW w:type="dxa" w:w="2928"/>
+            <w:tcW w:w="2928" w:type="dxa"/>
           </w:tcPr>
           <w:p>
             <w:r>
+              <w:lastRenderedPageBreak/>
               <w:t>~/.claude/hooks-handlers/init-ai.sh</w:t>
             </w:r>
           </w:p>
         </w:tc>
         <w:tc>
           <w:tcPr>
-            <w:tcW w:type="dxa" w:w="2928"/>
+            <w:tcW w:w="2928" w:type="dxa"/>
           </w:tcPr>
           <w:p>
+            <w:proofErr w:type="spellStart"/>
             <w:r>
-              <w:t>SessionStart hook — auto-inits .ai/, schedules 20-min tasks sync</w:t>
+              <w:t>SessionStart</w:t>
+            </w:r>
+            <w:proofErr w:type="spellEnd"/>
+            <w:r>
+              <w:t xml:space="preserve"> hook — auto-</w:t>
+            </w:r>
+            <w:proofErr w:type="spellStart"/>
+            <w:r>
+              <w:t>inits</w:t>
+            </w:r>
+            <w:proofErr w:type="spellEnd"/>
+            <w:r>
+              <w:t xml:space="preserve"> .ai/, schedules 20-min tasks sync</w:t>
             </w:r>
           </w:p>
         </w:tc>
         <w:tc>
           <w:tcPr>
-            <w:tcW w:type="dxa" w:w="2928"/>
+            <w:tcW w:w="2928" w:type="dxa"/>
           </w:tcPr>
           <w:p/>
         </w:tc>
@@ -1008,7 +1292,23 @@
         <w:pStyle w:val="ListBullet"/>
       </w:pPr>
       <w:r>
-        <w:t>Claude Code installed: npm install -g @anthropic-ai/claude-code</w:t>
+        <w:t xml:space="preserve">Claude Code installed: </w:t>
+      </w:r>
+      <w:proofErr w:type="spellStart"/>
+      <w:r>
+        <w:t>npm</w:t>
+      </w:r>
+      <w:proofErr w:type="spellEnd"/>
+      <w:r>
+        <w:t xml:space="preserve"> install -</w:t>
+      </w:r>
+      <w:proofErr w:type="gramStart"/>
+      <w:r>
+        <w:t>g @</w:t>
+      </w:r>
+      <w:proofErr w:type="gramEnd"/>
+      <w:r>
+        <w:t>anthropic-ai/claude-code</w:t>
       </w:r>
     </w:p>
     <w:p>
@@ -1022,7 +1322,15 @@
         <w:t xml:space="preserve"> (if you have a login from ON24, you can skip this)</w:t>
       </w:r>
       <w:r>
-        <w:t>: export ANTHROPIC_API_KEY=sk-ant-...</w:t>
+        <w:t>: export ANTHROPIC_API_KEY=</w:t>
+      </w:r>
+      <w:proofErr w:type="spellStart"/>
+      <w:r>
+        <w:t>sk</w:t>
+      </w:r>
+      <w:proofErr w:type="spellEnd"/>
+      <w:r>
+        <w:t>-ant-...</w:t>
       </w:r>
     </w:p>
     <w:p>
@@ -1047,7 +1355,20 @@
     </w:p>
     <w:p>
       <w:r>
-        <w:t>If you already have a ~/.claude directory, back it up first:</w:t>
+        <w:t>If you already have a ~</w:t>
+      </w:r>
+      <w:proofErr w:type="gramStart"/>
+      <w:r>
+        <w:t>/.</w:t>
+      </w:r>
+      <w:proofErr w:type="spellStart"/>
+      <w:r>
+        <w:t>claude</w:t>
+      </w:r>
+      <w:proofErr w:type="spellEnd"/>
+      <w:proofErr w:type="gramEnd"/>
+      <w:r>
+        <w:t xml:space="preserve"> directory, back it up first:</w:t>
       </w:r>
     </w:p>
     <w:p>
@@ -1062,8 +1383,56 @@
           <w:color w:val="24292F"/>
           <w:sz w:val="18"/>
         </w:rPr>
-        <w:t>mv ~/.claude ~/.claude.bak</w:t>
-      </w:r>
+        <w:t>mv ~</w:t>
+      </w:r>
+      <w:proofErr w:type="gramStart"/>
+      <w:r>
+        <w:rPr>
+          <w:rFonts w:ascii="Courier New" w:hAnsi="Courier New"/>
+          <w:color w:val="24292F"/>
+          <w:sz w:val="18"/>
+        </w:rPr>
+        <w:t>/.</w:t>
+      </w:r>
+      <w:proofErr w:type="spellStart"/>
+      <w:r>
+        <w:rPr>
+          <w:rFonts w:ascii="Courier New" w:hAnsi="Courier New"/>
+          <w:color w:val="24292F"/>
+          <w:sz w:val="18"/>
+        </w:rPr>
+        <w:t>claude</w:t>
+      </w:r>
+      <w:proofErr w:type="spellEnd"/>
+      <w:proofErr w:type="gramEnd"/>
+      <w:r>
+        <w:rPr>
+          <w:rFonts w:ascii="Courier New" w:hAnsi="Courier New"/>
+          <w:color w:val="24292F"/>
+          <w:sz w:val="18"/>
+        </w:rPr>
+        <w:t xml:space="preserve"> ~</w:t>
+      </w:r>
+      <w:proofErr w:type="gramStart"/>
+      <w:r>
+        <w:rPr>
+          <w:rFonts w:ascii="Courier New" w:hAnsi="Courier New"/>
+          <w:color w:val="24292F"/>
+          <w:sz w:val="18"/>
+        </w:rPr>
+        <w:t>/.</w:t>
+      </w:r>
+      <w:proofErr w:type="spellStart"/>
+      <w:r>
+        <w:rPr>
+          <w:rFonts w:ascii="Courier New" w:hAnsi="Courier New"/>
+          <w:color w:val="24292F"/>
+          <w:sz w:val="18"/>
+        </w:rPr>
+        <w:t>claude.bak</w:t>
+      </w:r>
+      <w:proofErr w:type="spellEnd"/>
+      <w:proofErr w:type="gramEnd"/>
     </w:p>
     <w:p/>
     <w:p>
@@ -1109,8 +1478,64 @@
           <w:color w:val="24292F"/>
           <w:sz w:val="18"/>
         </w:rPr>
-        <w:t>cp -r claude-code-template/.claude_on24template ~/.claude</w:t>
-      </w:r>
+        <w:t xml:space="preserve">cp -r </w:t>
+      </w:r>
+      <w:proofErr w:type="spellStart"/>
+      <w:r>
+        <w:rPr>
+          <w:rFonts w:ascii="Courier New" w:hAnsi="Courier New"/>
+          <w:color w:val="24292F"/>
+          <w:sz w:val="18"/>
+        </w:rPr>
+        <w:t>claude</w:t>
+      </w:r>
+      <w:proofErr w:type="spellEnd"/>
+      <w:r>
+        <w:rPr>
+          <w:rFonts w:ascii="Courier New" w:hAnsi="Courier New"/>
+          <w:color w:val="24292F"/>
+          <w:sz w:val="18"/>
+        </w:rPr>
+        <w:t>-code-template</w:t>
+      </w:r>
+      <w:proofErr w:type="gramStart"/>
+      <w:r>
+        <w:rPr>
+          <w:rFonts w:ascii="Courier New" w:hAnsi="Courier New"/>
+          <w:color w:val="24292F"/>
+          <w:sz w:val="18"/>
+        </w:rPr>
+        <w:t>/.claude</w:t>
+      </w:r>
+      <w:proofErr w:type="gramEnd"/>
+      <w:r>
+        <w:rPr>
+          <w:rFonts w:ascii="Courier New" w:hAnsi="Courier New"/>
+          <w:color w:val="24292F"/>
+          <w:sz w:val="18"/>
+        </w:rPr>
+        <w:t>_on24template ~</w:t>
+      </w:r>
+      <w:proofErr w:type="gramStart"/>
+      <w:r>
+        <w:rPr>
+          <w:rFonts w:ascii="Courier New" w:hAnsi="Courier New"/>
+          <w:color w:val="24292F"/>
+          <w:sz w:val="18"/>
+        </w:rPr>
+        <w:t>/.</w:t>
+      </w:r>
+      <w:proofErr w:type="spellStart"/>
+      <w:r>
+        <w:rPr>
+          <w:rFonts w:ascii="Courier New" w:hAnsi="Courier New"/>
+          <w:color w:val="24292F"/>
+          <w:sz w:val="18"/>
+        </w:rPr>
+        <w:t>claude</w:t>
+      </w:r>
+      <w:proofErr w:type="spellEnd"/>
+      <w:proofErr w:type="gramEnd"/>
     </w:p>
     <w:p/>
     <w:p>
@@ -1135,13 +1560,23 @@
         <w:spacing w:before="40" w:after="40"/>
         <w:ind w:left="576"/>
       </w:pPr>
+      <w:proofErr w:type="spellStart"/>
       <w:r>
         <w:rPr>
           <w:rFonts w:ascii="Courier New" w:hAnsi="Courier New"/>
           <w:color w:val="24292F"/>
           <w:sz w:val="18"/>
         </w:rPr>
-        <w:t>claude plugin install superpowers</w:t>
+        <w:t>claude</w:t>
+      </w:r>
+      <w:proofErr w:type="spellEnd"/>
+      <w:r>
+        <w:rPr>
+          <w:rFonts w:ascii="Courier New" w:hAnsi="Courier New"/>
+          <w:color w:val="24292F"/>
+          <w:sz w:val="18"/>
+        </w:rPr>
+        <w:t xml:space="preserve"> plugin install superpowers</w:t>
       </w:r>
     </w:p>
     <w:p>
@@ -1150,13 +1585,23 @@
         <w:spacing w:before="40" w:after="40"/>
         <w:ind w:left="576"/>
       </w:pPr>
+      <w:proofErr w:type="spellStart"/>
       <w:r>
         <w:rPr>
           <w:rFonts w:ascii="Courier New" w:hAnsi="Courier New"/>
           <w:color w:val="24292F"/>
           <w:sz w:val="18"/>
         </w:rPr>
-        <w:t>claude plugin install slack</w:t>
+        <w:t>claude</w:t>
+      </w:r>
+      <w:proofErr w:type="spellEnd"/>
+      <w:r>
+        <w:rPr>
+          <w:rFonts w:ascii="Courier New" w:hAnsi="Courier New"/>
+          <w:color w:val="24292F"/>
+          <w:sz w:val="18"/>
+        </w:rPr>
+        <w:t xml:space="preserve"> plugin install slack</w:t>
       </w:r>
     </w:p>
     <w:p>
@@ -1165,13 +1610,23 @@
         <w:spacing w:before="40" w:after="40"/>
         <w:ind w:left="576"/>
       </w:pPr>
+      <w:proofErr w:type="spellStart"/>
       <w:r>
         <w:rPr>
           <w:rFonts w:ascii="Courier New" w:hAnsi="Courier New"/>
           <w:color w:val="24292F"/>
           <w:sz w:val="18"/>
         </w:rPr>
-        <w:t>claude plugin install ralph-loop</w:t>
+        <w:t>claude</w:t>
+      </w:r>
+      <w:proofErr w:type="spellEnd"/>
+      <w:r>
+        <w:rPr>
+          <w:rFonts w:ascii="Courier New" w:hAnsi="Courier New"/>
+          <w:color w:val="24292F"/>
+          <w:sz w:val="18"/>
+        </w:rPr>
+        <w:t xml:space="preserve"> plugin install ralph-loop</w:t>
       </w:r>
     </w:p>
     <w:p>
@@ -1180,13 +1635,23 @@
         <w:spacing w:before="40" w:after="40"/>
         <w:ind w:left="576"/>
       </w:pPr>
+      <w:proofErr w:type="spellStart"/>
       <w:r>
         <w:rPr>
           <w:rFonts w:ascii="Courier New" w:hAnsi="Courier New"/>
           <w:color w:val="24292F"/>
           <w:sz w:val="18"/>
         </w:rPr>
-        <w:t>claude plugin install frontend-design</w:t>
+        <w:t>claude</w:t>
+      </w:r>
+      <w:proofErr w:type="spellEnd"/>
+      <w:r>
+        <w:rPr>
+          <w:rFonts w:ascii="Courier New" w:hAnsi="Courier New"/>
+          <w:color w:val="24292F"/>
+          <w:sz w:val="18"/>
+        </w:rPr>
+        <w:t xml:space="preserve"> plugin install frontend-design</w:t>
       </w:r>
     </w:p>
     <w:p>
@@ -1195,18 +1660,49 @@
         <w:spacing w:before="40" w:after="40"/>
         <w:ind w:left="576"/>
       </w:pPr>
+      <w:proofErr w:type="spellStart"/>
       <w:r>
         <w:rPr>
           <w:rFonts w:ascii="Courier New" w:hAnsi="Courier New"/>
           <w:color w:val="24292F"/>
           <w:sz w:val="18"/>
         </w:rPr>
-        <w:t>claude plugin install security-guidance</w:t>
-      </w:r>
-    </w:p>
-    <w:p>
-      <w:r>
-        <w:t>This downloads plugin code into ~/.claude/plugins/cache/. Takes ~1 minute.</w:t>
+        <w:t>claude</w:t>
+      </w:r>
+      <w:proofErr w:type="spellEnd"/>
+      <w:r>
+        <w:rPr>
+          <w:rFonts w:ascii="Courier New" w:hAnsi="Courier New"/>
+          <w:color w:val="24292F"/>
+          <w:sz w:val="18"/>
+        </w:rPr>
+        <w:t xml:space="preserve"> plugin install security-guidance</w:t>
+      </w:r>
+    </w:p>
+    <w:p>
+      <w:r>
+        <w:t>This downloads plugin code into ~</w:t>
+      </w:r>
+      <w:proofErr w:type="gramStart"/>
+      <w:r>
+        <w:t>/.</w:t>
+      </w:r>
+      <w:proofErr w:type="spellStart"/>
+      <w:r>
+        <w:t>claude</w:t>
+      </w:r>
+      <w:proofErr w:type="spellEnd"/>
+      <w:proofErr w:type="gramEnd"/>
+      <w:r>
+        <w:t xml:space="preserve">/plugins/cache/. </w:t>
+      </w:r>
+      <w:proofErr w:type="gramStart"/>
+      <w:r>
+        <w:t>Takes</w:t>
+      </w:r>
+      <w:proofErr w:type="gramEnd"/>
+      <w:r>
+        <w:t xml:space="preserve"> ~1 minute.</w:t>
       </w:r>
     </w:p>
     <w:p/>
@@ -1223,7 +1719,15 @@
     </w:p>
     <w:p>
       <w:r>
-        <w:t>Edit ~/.claude/projects/template/memory/user_profile.md and fill in your role, stack, and working style. Claude reads this to tailor responses to you specifically.</w:t>
+        <w:t>Edit ~</w:t>
+      </w:r>
+      <w:proofErr w:type="gramStart"/>
+      <w:r>
+        <w:t>/.claude/projects/template/memory/user_profile.md</w:t>
+      </w:r>
+      <w:proofErr w:type="gramEnd"/>
+      <w:r>
+        <w:t xml:space="preserve"> and fill in your role, stack, and working style. Claude reads this to tailor responses to you specifically.</w:t>
       </w:r>
     </w:p>
     <w:p/>
@@ -1249,6 +1753,7 @@
         <w:spacing w:before="40" w:after="40"/>
         <w:ind w:left="576"/>
       </w:pPr>
+      <w:proofErr w:type="spellStart"/>
       <w:r>
         <w:rPr>
           <w:rFonts w:ascii="Courier New" w:hAnsi="Courier New"/>
@@ -1257,11 +1762,28 @@
         </w:rPr>
         <w:t>claude</w:t>
       </w:r>
+      <w:proofErr w:type="spellEnd"/>
     </w:p>
     <w:p>
       <w:r>
         <w:lastRenderedPageBreak/>
-        <w:t>You should see Claude start. Type: 'what skills do you have?' and confirm prd and adr appear in the list.</w:t>
+        <w:t xml:space="preserve">You should see Claude start. Type: 'what skills do you have?' and confirm </w:t>
+      </w:r>
+      <w:proofErr w:type="spellStart"/>
+      <w:r>
+        <w:t>prd</w:t>
+      </w:r>
+      <w:proofErr w:type="spellEnd"/>
+      <w:r>
+        <w:t xml:space="preserve"> and </w:t>
+      </w:r>
+      <w:proofErr w:type="spellStart"/>
+      <w:r>
+        <w:t>adr</w:t>
+      </w:r>
+      <w:proofErr w:type="spellEnd"/>
+      <w:r>
+        <w:t xml:space="preserve"> appear in the list.</w:t>
       </w:r>
     </w:p>
     <w:p/>
@@ -1270,6 +1792,7 @@
         <w:shd w:val="clear" w:color="auto" w:fill="EBF3FB"/>
         <w:ind w:left="432"/>
       </w:pPr>
+      <w:proofErr w:type="gramStart"/>
       <w:r>
         <w:rPr>
           <w:b/>
@@ -1277,8 +1800,27 @@
         </w:rPr>
         <w:t xml:space="preserve">WINDOWS  </w:t>
       </w:r>
-      <w:r>
-        <w:t>Windows users: use ~/.claude as-is. Claude Code on Windows resolves ~ to C:\Users\&lt;username&gt;. Git Bash, WSL, and PowerShell all work.</w:t>
+      <w:proofErr w:type="spellStart"/>
+      <w:r>
+        <w:t>Windows</w:t>
+      </w:r>
+      <w:proofErr w:type="spellEnd"/>
+      <w:proofErr w:type="gramEnd"/>
+      <w:r>
+        <w:t xml:space="preserve"> users: use ~</w:t>
+      </w:r>
+      <w:proofErr w:type="gramStart"/>
+      <w:r>
+        <w:t>/.</w:t>
+      </w:r>
+      <w:proofErr w:type="spellStart"/>
+      <w:r>
+        <w:t>claude</w:t>
+      </w:r>
+      <w:proofErr w:type="spellEnd"/>
+      <w:proofErr w:type="gramEnd"/>
+      <w:r>
+        <w:t xml:space="preserve"> as-is. Claude Code on Windows resolves ~ to C:\Users\&lt;username&gt;. Git Bash, WSL, and PowerShell all work.</w:t>
       </w:r>
     </w:p>
     <w:p/>
@@ -1310,11 +1852,19 @@
       <w:pPr>
         <w:pStyle w:val="Heading2"/>
       </w:pPr>
+      <w:proofErr w:type="gramStart"/>
       <w:r>
         <w:rPr>
           <w:color w:val="1A1A2E"/>
         </w:rPr>
-        <w:t>4.1  CLAUDE.md — The Most Important File</w:t>
+        <w:t>4.1  CLAUDE.md</w:t>
+      </w:r>
+      <w:proofErr w:type="gramEnd"/>
+      <w:r>
+        <w:rPr>
+          <w:color w:val="1A1A2E"/>
+        </w:rPr>
+        <w:t xml:space="preserve"> — The Most Important File</w:t>
       </w:r>
     </w:p>
     <w:p>
@@ -1361,7 +1911,25 @@
           <w:color w:val="24292F"/>
           <w:sz w:val="18"/>
         </w:rPr>
-        <w:t>- Language: Python 3.11+  ← replace with your actual stack</w:t>
+        <w:t>- Language: Python 3.11</w:t>
+      </w:r>
+      <w:proofErr w:type="gramStart"/>
+      <w:r>
+        <w:rPr>
+          <w:rFonts w:ascii="Courier New" w:hAnsi="Courier New"/>
+          <w:color w:val="24292F"/>
+          <w:sz w:val="18"/>
+        </w:rPr>
+        <w:t>+  ←</w:t>
+      </w:r>
+      <w:proofErr w:type="gramEnd"/>
+      <w:r>
+        <w:rPr>
+          <w:rFonts w:ascii="Courier New" w:hAnsi="Courier New"/>
+          <w:color w:val="24292F"/>
+          <w:sz w:val="18"/>
+        </w:rPr>
+        <w:t xml:space="preserve"> replace with your actual stack</w:t>
       </w:r>
     </w:p>
     <w:p>
@@ -1376,7 +1944,25 @@
           <w:color w:val="24292F"/>
           <w:sz w:val="18"/>
         </w:rPr>
-        <w:t>- Framework: FastAPI       ← replace with your framework</w:t>
+        <w:t xml:space="preserve">- Framework: </w:t>
+      </w:r>
+      <w:proofErr w:type="spellStart"/>
+      <w:r>
+        <w:rPr>
+          <w:rFonts w:ascii="Courier New" w:hAnsi="Courier New"/>
+          <w:color w:val="24292F"/>
+          <w:sz w:val="18"/>
+        </w:rPr>
+        <w:t>FastAPI</w:t>
+      </w:r>
+      <w:proofErr w:type="spellEnd"/>
+      <w:r>
+        <w:rPr>
+          <w:rFonts w:ascii="Courier New" w:hAnsi="Courier New"/>
+          <w:color w:val="24292F"/>
+          <w:sz w:val="18"/>
+        </w:rPr>
+        <w:t xml:space="preserve">       ← replace with your framework</w:t>
       </w:r>
     </w:p>
     <w:p>
@@ -1391,7 +1977,43 @@
           <w:color w:val="24292F"/>
           <w:sz w:val="18"/>
         </w:rPr>
-        <w:t>- Package mgr: pnpm        ← replace with yours</w:t>
+        <w:t xml:space="preserve">- Package </w:t>
+      </w:r>
+      <w:proofErr w:type="spellStart"/>
+      <w:r>
+        <w:rPr>
+          <w:rFonts w:ascii="Courier New" w:hAnsi="Courier New"/>
+          <w:color w:val="24292F"/>
+          <w:sz w:val="18"/>
+        </w:rPr>
+        <w:t>mgr</w:t>
+      </w:r>
+      <w:proofErr w:type="spellEnd"/>
+      <w:r>
+        <w:rPr>
+          <w:rFonts w:ascii="Courier New" w:hAnsi="Courier New"/>
+          <w:color w:val="24292F"/>
+          <w:sz w:val="18"/>
+        </w:rPr>
+        <w:t xml:space="preserve">: </w:t>
+      </w:r>
+      <w:proofErr w:type="spellStart"/>
+      <w:r>
+        <w:rPr>
+          <w:rFonts w:ascii="Courier New" w:hAnsi="Courier New"/>
+          <w:color w:val="24292F"/>
+          <w:sz w:val="18"/>
+        </w:rPr>
+        <w:t>pnpm</w:t>
+      </w:r>
+      <w:proofErr w:type="spellEnd"/>
+      <w:r>
+        <w:rPr>
+          <w:rFonts w:ascii="Courier New" w:hAnsi="Courier New"/>
+          <w:color w:val="24292F"/>
+          <w:sz w:val="18"/>
+        </w:rPr>
+        <w:t xml:space="preserve">        ← replace with yours</w:t>
       </w:r>
     </w:p>
     <w:p>
@@ -1406,7 +2028,25 @@
           <w:color w:val="24292F"/>
           <w:sz w:val="18"/>
         </w:rPr>
-        <w:t>- Testing: pytest          ← replace with your test runner</w:t>
+        <w:t xml:space="preserve">- Testing: </w:t>
+      </w:r>
+      <w:proofErr w:type="spellStart"/>
+      <w:r>
+        <w:rPr>
+          <w:rFonts w:ascii="Courier New" w:hAnsi="Courier New"/>
+          <w:color w:val="24292F"/>
+          <w:sz w:val="18"/>
+        </w:rPr>
+        <w:t>pytest</w:t>
+      </w:r>
+      <w:proofErr w:type="spellEnd"/>
+      <w:r>
+        <w:rPr>
+          <w:rFonts w:ascii="Courier New" w:hAnsi="Courier New"/>
+          <w:color w:val="24292F"/>
+          <w:sz w:val="18"/>
+        </w:rPr>
+        <w:t xml:space="preserve">          ← replace with your test runner</w:t>
       </w:r>
     </w:p>
     <w:p>
@@ -1423,7 +2063,35 @@
         <w:rPr>
           <w:color w:val="1A1A2E"/>
         </w:rPr>
-        <w:t>4.2  settings.json — Permissions and Plugins</w:t>
+        <w:t>4.</w:t>
+      </w:r>
+      <w:proofErr w:type="gramStart"/>
+      <w:r>
+        <w:rPr>
+          <w:color w:val="1A1A2E"/>
+        </w:rPr>
+        <w:t xml:space="preserve">2  </w:t>
+      </w:r>
+      <w:proofErr w:type="spellStart"/>
+      <w:r>
+        <w:rPr>
+          <w:color w:val="1A1A2E"/>
+        </w:rPr>
+        <w:t>settings</w:t>
+      </w:r>
+      <w:proofErr w:type="gramEnd"/>
+      <w:r>
+        <w:rPr>
+          <w:color w:val="1A1A2E"/>
+        </w:rPr>
+        <w:t>.json</w:t>
+      </w:r>
+      <w:proofErr w:type="spellEnd"/>
+      <w:r>
+        <w:rPr>
+          <w:color w:val="1A1A2E"/>
+        </w:rPr>
+        <w:t xml:space="preserve"> — Permissions and Plugins</w:t>
       </w:r>
     </w:p>
     <w:p>
@@ -1477,8 +2145,21 @@
             <w:tcW w:w="4392" w:type="dxa"/>
           </w:tcPr>
           <w:p>
+            <w:proofErr w:type="spellStart"/>
             <w:r>
-              <w:t>defaultMode: "dontAsk"</w:t>
+              <w:t>defaultMode</w:t>
+            </w:r>
+            <w:proofErr w:type="spellEnd"/>
+            <w:r>
+              <w:t>: "</w:t>
+            </w:r>
+            <w:proofErr w:type="spellStart"/>
+            <w:r>
+              <w:t>dontAsk</w:t>
+            </w:r>
+            <w:proofErr w:type="spellEnd"/>
+            <w:r>
+              <w:t>"</w:t>
             </w:r>
           </w:p>
         </w:tc>
@@ -1510,7 +2191,47 @@
           </w:tcPr>
           <w:p>
             <w:r>
-              <w:t>Pre-approved: git status/diff/log, npm/pnpm/yarn run, pytest, uvicorn, Read(**). Add your team's common commands here.</w:t>
+              <w:t xml:space="preserve">Pre-approved: git status/diff/log, </w:t>
+            </w:r>
+            <w:proofErr w:type="spellStart"/>
+            <w:r>
+              <w:t>npm</w:t>
+            </w:r>
+            <w:proofErr w:type="spellEnd"/>
+            <w:r>
+              <w:t>/</w:t>
+            </w:r>
+            <w:proofErr w:type="spellStart"/>
+            <w:r>
+              <w:t>pnpm</w:t>
+            </w:r>
+            <w:proofErr w:type="spellEnd"/>
+            <w:r>
+              <w:t xml:space="preserve">/yarn run, </w:t>
+            </w:r>
+            <w:proofErr w:type="spellStart"/>
+            <w:r>
+              <w:t>pytest</w:t>
+            </w:r>
+            <w:proofErr w:type="spellEnd"/>
+            <w:r>
+              <w:t xml:space="preserve">, </w:t>
+            </w:r>
+            <w:proofErr w:type="spellStart"/>
+            <w:r>
+              <w:t>uvicorn</w:t>
+            </w:r>
+            <w:proofErr w:type="spellEnd"/>
+            <w:r>
+              <w:t xml:space="preserve">, </w:t>
+            </w:r>
+            <w:proofErr w:type="gramStart"/>
+            <w:r>
+              <w:t>Read(</w:t>
+            </w:r>
+            <w:proofErr w:type="gramEnd"/>
+            <w:r>
+              <w:t>**). Add your team's common commands here.</w:t>
             </w:r>
           </w:p>
         </w:tc>
@@ -1532,7 +2253,28 @@
           </w:tcPr>
           <w:p>
             <w:r>
-              <w:t>Blocks reading .env, .env.*, secrets/, credentials*.json. Do not remove these.</w:t>
+              <w:t xml:space="preserve">Blocks </w:t>
+            </w:r>
+            <w:proofErr w:type="gramStart"/>
+            <w:r>
+              <w:t>reading .env, .env</w:t>
+            </w:r>
+            <w:proofErr w:type="gramEnd"/>
+            <w:r>
+              <w:t>.*, secrets/, credentials</w:t>
+            </w:r>
+            <w:proofErr w:type="gramStart"/>
+            <w:r>
+              <w:t>*.</w:t>
+            </w:r>
+            <w:proofErr w:type="spellStart"/>
+            <w:r>
+              <w:t>json</w:t>
+            </w:r>
+            <w:proofErr w:type="spellEnd"/>
+            <w:proofErr w:type="gramEnd"/>
+            <w:r>
+              <w:t>. Do not remove these.</w:t>
             </w:r>
           </w:p>
         </w:tc>
@@ -1543,9 +2285,11 @@
             <w:tcW w:w="4392" w:type="dxa"/>
           </w:tcPr>
           <w:p>
+            <w:proofErr w:type="spellStart"/>
             <w:r>
               <w:t>enabledPlugins</w:t>
             </w:r>
+            <w:proofErr w:type="spellEnd"/>
           </w:p>
         </w:tc>
         <w:tc>
@@ -1565,8 +2309,13 @@
             <w:tcW w:w="4392" w:type="dxa"/>
           </w:tcPr>
           <w:p>
+            <w:proofErr w:type="spellStart"/>
             <w:r>
-              <w:t>outputStyle: "Concise"</w:t>
+              <w:t>outputStyle</w:t>
+            </w:r>
+            <w:proofErr w:type="spellEnd"/>
+            <w:r>
+              <w:t>: "Concise"</w:t>
             </w:r>
           </w:p>
         </w:tc>
@@ -1587,11 +2336,19 @@
       <w:pPr>
         <w:pStyle w:val="Heading2"/>
       </w:pPr>
+      <w:proofErr w:type="gramStart"/>
       <w:r>
         <w:rPr>
           <w:color w:val="1A1A2E"/>
         </w:rPr>
-        <w:t>4.3  MCP Servers (Optional but Recommended)</w:t>
+        <w:t>4.3  MCP</w:t>
+      </w:r>
+      <w:proofErr w:type="gramEnd"/>
+      <w:r>
+        <w:rPr>
+          <w:color w:val="1A1A2E"/>
+        </w:rPr>
+        <w:t xml:space="preserve"> Servers (Optional but Recommended)</w:t>
       </w:r>
     </w:p>
     <w:p>
@@ -1609,9 +2366,36 @@
     </w:p>
     <w:p>
       <w:r>
-        <w:t>Add MCP servers via: Settings &gt; MCP Servers in the Claude Code UI, or claude mcp add.</w:t>
+        <w:lastRenderedPageBreak/>
+        <w:t xml:space="preserve">Add MCP servers via: Settings &gt; MCP Servers in the Claude Code UI, or </w:t>
+      </w:r>
+      <w:proofErr w:type="spellStart"/>
+      <w:r>
+        <w:t>claude</w:t>
+      </w:r>
+      <w:proofErr w:type="spellEnd"/>
+      <w:r>
+        <w:t xml:space="preserve"> </w:t>
+      </w:r>
+      <w:proofErr w:type="spellStart"/>
+      <w:r>
+        <w:t>mcp</w:t>
+      </w:r>
+      <w:proofErr w:type="spellEnd"/>
+      <w:r>
+        <w:t xml:space="preserve"> add.</w:t>
+      </w:r>
+      <w:r>
         <w:br/>
-        <w:t>Setup: export GITLAB_PERSONAL_ACCESS_TOKEN=&lt;your-token&gt; then add the server with url https://gitlab.com/api/v4/mcp.</w:t>
+        <w:t xml:space="preserve">Setup: export GITLAB_PERSONAL_ACCESS_TOKEN=&lt;your-token&gt; then add the server with </w:t>
+      </w:r>
+      <w:proofErr w:type="spellStart"/>
+      <w:r>
+        <w:t>url</w:t>
+      </w:r>
+      <w:proofErr w:type="spellEnd"/>
+      <w:r>
+        <w:t xml:space="preserve"> https://gitlab.com/api/v4/mcp.</w:t>
       </w:r>
     </w:p>
     <w:p/>
@@ -1623,12 +2407,72 @@
         <w:rPr>
           <w:color w:val="1A1A2E"/>
         </w:rPr>
-        <w:t>4.4  settings.local.json — Machine-Specific Overrides</w:t>
-      </w:r>
-    </w:p>
-    <w:p>
-      <w:r>
-        <w:t>This file is gitignored. Use it for personal overrides that shouldn't be shared, such as enabling bypassPermissions mode on your dev machine or overriding outputStyle.</w:t>
+        <w:t>4.</w:t>
+      </w:r>
+      <w:proofErr w:type="gramStart"/>
+      <w:r>
+        <w:rPr>
+          <w:color w:val="1A1A2E"/>
+        </w:rPr>
+        <w:t xml:space="preserve">4  </w:t>
+      </w:r>
+      <w:proofErr w:type="spellStart"/>
+      <w:r>
+        <w:rPr>
+          <w:color w:val="1A1A2E"/>
+        </w:rPr>
+        <w:t>settings</w:t>
+      </w:r>
+      <w:proofErr w:type="gramEnd"/>
+      <w:r>
+        <w:rPr>
+          <w:color w:val="1A1A2E"/>
+        </w:rPr>
+        <w:t>.</w:t>
+      </w:r>
+      <w:proofErr w:type="gramStart"/>
+      <w:r>
+        <w:rPr>
+          <w:color w:val="1A1A2E"/>
+        </w:rPr>
+        <w:t>local.json</w:t>
+      </w:r>
+      <w:proofErr w:type="spellEnd"/>
+      <w:proofErr w:type="gramEnd"/>
+      <w:r>
+        <w:rPr>
+          <w:color w:val="1A1A2E"/>
+        </w:rPr>
+        <w:t xml:space="preserve"> — Machine-Specific Overrides</w:t>
+      </w:r>
+    </w:p>
+    <w:p>
+      <w:r>
+        <w:t xml:space="preserve">This file is </w:t>
+      </w:r>
+      <w:proofErr w:type="spellStart"/>
+      <w:r>
+        <w:t>gitignored</w:t>
+      </w:r>
+      <w:proofErr w:type="spellEnd"/>
+      <w:r>
+        <w:t xml:space="preserve">. Use it for personal overrides that shouldn't be shared, such as enabling </w:t>
+      </w:r>
+      <w:proofErr w:type="spellStart"/>
+      <w:r>
+        <w:t>bypassPermissions</w:t>
+      </w:r>
+      <w:proofErr w:type="spellEnd"/>
+      <w:r>
+        <w:t xml:space="preserve"> mode on your dev machine or overriding </w:t>
+      </w:r>
+      <w:proofErr w:type="spellStart"/>
+      <w:r>
+        <w:t>outputStyle</w:t>
+      </w:r>
+      <w:proofErr w:type="spellEnd"/>
+      <w:r>
+        <w:t>.</w:t>
       </w:r>
     </w:p>
     <w:p>
@@ -1636,6 +2480,7 @@
         <w:shd w:val="clear" w:color="auto" w:fill="EBF3FB"/>
         <w:ind w:left="432"/>
       </w:pPr>
+      <w:proofErr w:type="gramStart"/>
       <w:r>
         <w:rPr>
           <w:b/>
@@ -1644,7 +2489,37 @@
         <w:t xml:space="preserve">SECURITY  </w:t>
       </w:r>
       <w:r>
-        <w:t>Never commit settings.local.json. It is in .gitignore by default.</w:t>
+        <w:t>Never</w:t>
+      </w:r>
+      <w:proofErr w:type="gramEnd"/>
+      <w:r>
+        <w:t xml:space="preserve"> commit </w:t>
+      </w:r>
+      <w:proofErr w:type="spellStart"/>
+      <w:proofErr w:type="gramStart"/>
+      <w:r>
+        <w:t>settings.local</w:t>
+      </w:r>
+      <w:proofErr w:type="gramEnd"/>
+      <w:r>
+        <w:t>.json</w:t>
+      </w:r>
+      <w:proofErr w:type="spellEnd"/>
+      <w:r>
+        <w:t xml:space="preserve">. It is </w:t>
+      </w:r>
+      <w:proofErr w:type="gramStart"/>
+      <w:r>
+        <w:t>in .</w:t>
+      </w:r>
+      <w:proofErr w:type="spellStart"/>
+      <w:r>
+        <w:t>gitignore</w:t>
+      </w:r>
+      <w:proofErr w:type="spellEnd"/>
+      <w:proofErr w:type="gramEnd"/>
+      <w:r>
+        <w:t xml:space="preserve"> by default.</w:t>
       </w:r>
     </w:p>
     <w:p/>
@@ -1676,11 +2551,19 @@
       <w:pPr>
         <w:pStyle w:val="Heading2"/>
       </w:pPr>
+      <w:proofErr w:type="gramStart"/>
       <w:r>
         <w:rPr>
           <w:color w:val="1A1A2E"/>
         </w:rPr>
-        <w:t>5.1  The Standard Development Loop</w:t>
+        <w:t>5.1  The</w:t>
+      </w:r>
+      <w:proofErr w:type="gramEnd"/>
+      <w:r>
+        <w:rPr>
+          <w:color w:val="1A1A2E"/>
+        </w:rPr>
+        <w:t xml:space="preserve"> Standard Development Loop</w:t>
       </w:r>
     </w:p>
     <w:p>
@@ -1700,7 +2583,31 @@
         <w:t xml:space="preserve">1. PRD: </w:t>
       </w:r>
       <w:r>
-        <w:t>Say "I want to build X" → Claude invokes /prd → guided session captures problem, personas, success criteria, acceptance criteria → saved to docs/prd/</w:t>
+        <w:t>Say "I want to build X" → Claude invokes /</w:t>
+      </w:r>
+      <w:proofErr w:type="spellStart"/>
+      <w:r>
+        <w:t>prd</w:t>
+      </w:r>
+      <w:proofErr w:type="spellEnd"/>
+      <w:r>
+        <w:t xml:space="preserve"> → guided session captures problem, personas, success criteria, acceptance </w:t>
+      </w:r>
+      <w:proofErr w:type="gramStart"/>
+      <w:r>
+        <w:t>criteria → saved</w:t>
+      </w:r>
+      <w:proofErr w:type="gramEnd"/>
+      <w:r>
+        <w:t xml:space="preserve"> to docs/</w:t>
+      </w:r>
+      <w:proofErr w:type="spellStart"/>
+      <w:r>
+        <w:t>prd</w:t>
+      </w:r>
+      <w:proofErr w:type="spellEnd"/>
+      <w:r>
+        <w:t>/</w:t>
       </w:r>
     </w:p>
     <w:p>
@@ -1784,10 +2691,22 @@
           <w:b/>
           <w:color w:val="0047AB"/>
         </w:rPr>
-        <w:t xml:space="preserve">HOW IT WORKS  </w:t>
-      </w:r>
-      <w:r>
-        <w:t>You do not need to remember this flow. The Superpowers plugin and CLAUDE.md instructions make Claude follow it automatically. Just describe what you want to build.</w:t>
+        <w:t xml:space="preserve">HOW IT </w:t>
+      </w:r>
+      <w:proofErr w:type="gramStart"/>
+      <w:r>
+        <w:rPr>
+          <w:b/>
+          <w:color w:val="0047AB"/>
+        </w:rPr>
+        <w:t xml:space="preserve">WORKS  </w:t>
+      </w:r>
+      <w:r>
+        <w:t>You</w:t>
+      </w:r>
+      <w:proofErr w:type="gramEnd"/>
+      <w:r>
+        <w:t xml:space="preserve"> do not need to remember this flow. The Superpowers plugin and CLAUDE.md instructions make Claude follow it automatically. Just describe what you want to build.</w:t>
       </w:r>
     </w:p>
     <w:p/>
@@ -1795,11 +2714,19 @@
       <w:pPr>
         <w:pStyle w:val="Heading2"/>
       </w:pPr>
+      <w:proofErr w:type="gramStart"/>
       <w:r>
         <w:rPr>
           <w:color w:val="1A1A2E"/>
         </w:rPr>
-        <w:t>5.2  Repo Memory Pattern</w:t>
+        <w:t>5.2  Repo</w:t>
+      </w:r>
+      <w:proofErr w:type="gramEnd"/>
+      <w:r>
+        <w:rPr>
+          <w:color w:val="1A1A2E"/>
+        </w:rPr>
+        <w:t xml:space="preserve"> Memory Pattern</w:t>
       </w:r>
     </w:p>
     <w:p>
@@ -1811,81 +2738,332 @@
       <w:pPr>
         <w:ind w:left="432"/>
       </w:pPr>
+      <w:proofErr w:type="gramStart"/>
       <w:r>
         <w:rPr>
           <w:rFonts w:ascii="Courier New" w:hAnsi="Courier New"/>
           <w:b/>
         </w:rPr>
-        <w:t xml:space="preserve">.ai/project.md  —  What this repo does, who uses it, key constraints  [auto-populated]  </w:t>
-      </w:r>
-      <w:r>
-        <w:t>What this repo does, who uses it, key constraints</w:t>
-      </w:r>
-    </w:p>
-    <w:p>
-      <w:pPr>
-        <w:ind w:left="432"/>
-      </w:pPr>
+        <w:t>.ai/project.md</w:t>
+      </w:r>
+      <w:proofErr w:type="gramEnd"/>
       <w:r>
         <w:rPr>
           <w:rFonts w:ascii="Courier New" w:hAnsi="Courier New"/>
           <w:b/>
         </w:rPr>
-        <w:t xml:space="preserve">.ai/architecture.md  —  System design, modules, data flow  [auto-populated]  </w:t>
-      </w:r>
-      <w:r>
-        <w:t>System design, modules, data flow</w:t>
-      </w:r>
-    </w:p>
-    <w:p>
-      <w:pPr>
-        <w:ind w:left="432"/>
-      </w:pPr>
+        <w:t xml:space="preserve">  </w:t>
+      </w:r>
+      <w:proofErr w:type="gramStart"/>
       <w:r>
         <w:rPr>
           <w:rFonts w:ascii="Courier New" w:hAnsi="Courier New"/>
           <w:b/>
         </w:rPr>
-        <w:t xml:space="preserve">.ai/commands.md  —  How to run, test, deploy — exact commands  [auto-populated]  </w:t>
-      </w:r>
-      <w:r>
-        <w:t>How to run, test, deploy — exact commands</w:t>
-      </w:r>
-    </w:p>
-    <w:p>
-      <w:pPr>
-        <w:ind w:left="432"/>
-      </w:pPr>
+        <w:t>—  What</w:t>
+      </w:r>
+      <w:proofErr w:type="gramEnd"/>
       <w:r>
         <w:rPr>
           <w:rFonts w:ascii="Courier New" w:hAnsi="Courier New"/>
           <w:b/>
         </w:rPr>
-        <w:t xml:space="preserve">.ai/tasks.md  —  Current sprint priorities and in-flight work  [auto-updated every 20 min]  </w:t>
-      </w:r>
-      <w:r>
-        <w:t>Current sprint priorities and in-flight work</w:t>
-      </w:r>
-    </w:p>
-    <w:p>
-      <w:pPr>
-        <w:ind w:left="432"/>
-      </w:pPr>
+        <w:t xml:space="preserve"> this repo does, who uses it, key </w:t>
+      </w:r>
+      <w:proofErr w:type="gramStart"/>
       <w:r>
         <w:rPr>
           <w:rFonts w:ascii="Courier New" w:hAnsi="Courier New"/>
           <w:b/>
         </w:rPr>
-        <w:t xml:space="preserve">.ai/decisions.md  </w:t>
-      </w:r>
-      <w:r>
-        <w:t>ADR log — use the adr skill to append entries</w:t>
+        <w:t>constraints  [</w:t>
+      </w:r>
+      <w:proofErr w:type="gramEnd"/>
+      <w:r>
+        <w:rPr>
+          <w:rFonts w:ascii="Courier New" w:hAnsi="Courier New"/>
+          <w:b/>
+        </w:rPr>
+        <w:t>auto-</w:t>
+      </w:r>
+      <w:proofErr w:type="gramStart"/>
+      <w:r>
+        <w:rPr>
+          <w:rFonts w:ascii="Courier New" w:hAnsi="Courier New"/>
+          <w:b/>
+        </w:rPr>
+        <w:t xml:space="preserve">populated]  </w:t>
+      </w:r>
+      <w:r>
+        <w:t>What</w:t>
+      </w:r>
+      <w:proofErr w:type="gramEnd"/>
+      <w:r>
+        <w:t xml:space="preserve"> this repo does, who uses it, key constraints</w:t>
+      </w:r>
+    </w:p>
+    <w:p>
+      <w:pPr>
+        <w:ind w:left="432"/>
+      </w:pPr>
+      <w:proofErr w:type="gramStart"/>
+      <w:r>
+        <w:rPr>
+          <w:rFonts w:ascii="Courier New" w:hAnsi="Courier New"/>
+          <w:b/>
+        </w:rPr>
+        <w:t>.ai/architecture.md</w:t>
+      </w:r>
+      <w:proofErr w:type="gramEnd"/>
+      <w:r>
+        <w:rPr>
+          <w:rFonts w:ascii="Courier New" w:hAnsi="Courier New"/>
+          <w:b/>
+        </w:rPr>
+        <w:t xml:space="preserve">  </w:t>
+      </w:r>
+      <w:proofErr w:type="gramStart"/>
+      <w:r>
+        <w:rPr>
+          <w:rFonts w:ascii="Courier New" w:hAnsi="Courier New"/>
+          <w:b/>
+        </w:rPr>
+        <w:t>—  System</w:t>
+      </w:r>
+      <w:proofErr w:type="gramEnd"/>
+      <w:r>
+        <w:rPr>
+          <w:rFonts w:ascii="Courier New" w:hAnsi="Courier New"/>
+          <w:b/>
+        </w:rPr>
+        <w:t xml:space="preserve"> design, modules, data </w:t>
+      </w:r>
+      <w:proofErr w:type="gramStart"/>
+      <w:r>
+        <w:rPr>
+          <w:rFonts w:ascii="Courier New" w:hAnsi="Courier New"/>
+          <w:b/>
+        </w:rPr>
+        <w:t>flow  [</w:t>
+      </w:r>
+      <w:proofErr w:type="gramEnd"/>
+      <w:r>
+        <w:rPr>
+          <w:rFonts w:ascii="Courier New" w:hAnsi="Courier New"/>
+          <w:b/>
+        </w:rPr>
+        <w:t>auto-</w:t>
+      </w:r>
+      <w:proofErr w:type="gramStart"/>
+      <w:r>
+        <w:rPr>
+          <w:rFonts w:ascii="Courier New" w:hAnsi="Courier New"/>
+          <w:b/>
+        </w:rPr>
+        <w:t xml:space="preserve">populated]  </w:t>
+      </w:r>
+      <w:r>
+        <w:t>System</w:t>
+      </w:r>
+      <w:proofErr w:type="gramEnd"/>
+      <w:r>
+        <w:t xml:space="preserve"> design, modules, data flow</w:t>
+      </w:r>
+    </w:p>
+    <w:p>
+      <w:pPr>
+        <w:ind w:left="432"/>
+      </w:pPr>
+      <w:proofErr w:type="gramStart"/>
+      <w:r>
+        <w:rPr>
+          <w:rFonts w:ascii="Courier New" w:hAnsi="Courier New"/>
+          <w:b/>
+        </w:rPr>
+        <w:t>.ai/commands.md</w:t>
+      </w:r>
+      <w:proofErr w:type="gramEnd"/>
+      <w:r>
+        <w:rPr>
+          <w:rFonts w:ascii="Courier New" w:hAnsi="Courier New"/>
+          <w:b/>
+        </w:rPr>
+        <w:t xml:space="preserve">  </w:t>
+      </w:r>
+      <w:proofErr w:type="gramStart"/>
+      <w:r>
+        <w:rPr>
+          <w:rFonts w:ascii="Courier New" w:hAnsi="Courier New"/>
+          <w:b/>
+        </w:rPr>
+        <w:t>—  How</w:t>
+      </w:r>
+      <w:proofErr w:type="gramEnd"/>
+      <w:r>
+        <w:rPr>
+          <w:rFonts w:ascii="Courier New" w:hAnsi="Courier New"/>
+          <w:b/>
+        </w:rPr>
+        <w:t xml:space="preserve"> to run, test, deploy — exact </w:t>
+      </w:r>
+      <w:proofErr w:type="gramStart"/>
+      <w:r>
+        <w:rPr>
+          <w:rFonts w:ascii="Courier New" w:hAnsi="Courier New"/>
+          <w:b/>
+        </w:rPr>
+        <w:t>commands  [</w:t>
+      </w:r>
+      <w:proofErr w:type="gramEnd"/>
+      <w:r>
+        <w:rPr>
+          <w:rFonts w:ascii="Courier New" w:hAnsi="Courier New"/>
+          <w:b/>
+        </w:rPr>
+        <w:t>auto-</w:t>
+      </w:r>
+      <w:proofErr w:type="gramStart"/>
+      <w:r>
+        <w:rPr>
+          <w:rFonts w:ascii="Courier New" w:hAnsi="Courier New"/>
+          <w:b/>
+        </w:rPr>
+        <w:t xml:space="preserve">populated]  </w:t>
+      </w:r>
+      <w:r>
+        <w:t>How</w:t>
+      </w:r>
+      <w:proofErr w:type="gramEnd"/>
+      <w:r>
+        <w:t xml:space="preserve"> to run, test, deploy — exact commands</w:t>
+      </w:r>
+    </w:p>
+    <w:p>
+      <w:pPr>
+        <w:ind w:left="432"/>
+      </w:pPr>
+      <w:proofErr w:type="gramStart"/>
+      <w:r>
+        <w:rPr>
+          <w:rFonts w:ascii="Courier New" w:hAnsi="Courier New"/>
+          <w:b/>
+        </w:rPr>
+        <w:lastRenderedPageBreak/>
+        <w:t>.ai/tasks.md</w:t>
+      </w:r>
+      <w:proofErr w:type="gramEnd"/>
+      <w:r>
+        <w:rPr>
+          <w:rFonts w:ascii="Courier New" w:hAnsi="Courier New"/>
+          <w:b/>
+        </w:rPr>
+        <w:t xml:space="preserve">  </w:t>
+      </w:r>
+      <w:proofErr w:type="gramStart"/>
+      <w:r>
+        <w:rPr>
+          <w:rFonts w:ascii="Courier New" w:hAnsi="Courier New"/>
+          <w:b/>
+        </w:rPr>
+        <w:t>—  Current</w:t>
+      </w:r>
+      <w:proofErr w:type="gramEnd"/>
+      <w:r>
+        <w:rPr>
+          <w:rFonts w:ascii="Courier New" w:hAnsi="Courier New"/>
+          <w:b/>
+        </w:rPr>
+        <w:t xml:space="preserve"> sprint priorities and in-flight </w:t>
+      </w:r>
+      <w:proofErr w:type="gramStart"/>
+      <w:r>
+        <w:rPr>
+          <w:rFonts w:ascii="Courier New" w:hAnsi="Courier New"/>
+          <w:b/>
+        </w:rPr>
+        <w:t>work  [</w:t>
+      </w:r>
+      <w:proofErr w:type="gramEnd"/>
+      <w:r>
+        <w:rPr>
+          <w:rFonts w:ascii="Courier New" w:hAnsi="Courier New"/>
+          <w:b/>
+        </w:rPr>
+        <w:t xml:space="preserve">auto-updated every 20 </w:t>
+      </w:r>
+      <w:proofErr w:type="gramStart"/>
+      <w:r>
+        <w:rPr>
+          <w:rFonts w:ascii="Courier New" w:hAnsi="Courier New"/>
+          <w:b/>
+        </w:rPr>
+        <w:t xml:space="preserve">min]  </w:t>
+      </w:r>
+      <w:r>
+        <w:t>Current</w:t>
+      </w:r>
+      <w:proofErr w:type="gramEnd"/>
+      <w:r>
+        <w:t xml:space="preserve"> sprint priorities and in-flight work</w:t>
+      </w:r>
+    </w:p>
+    <w:p>
+      <w:pPr>
+        <w:ind w:left="432"/>
+      </w:pPr>
+      <w:proofErr w:type="gramStart"/>
+      <w:r>
+        <w:rPr>
+          <w:rFonts w:ascii="Courier New" w:hAnsi="Courier New"/>
+          <w:b/>
+        </w:rPr>
+        <w:t>.ai/decisions.md</w:t>
+      </w:r>
+      <w:proofErr w:type="gramEnd"/>
+      <w:r>
+        <w:rPr>
+          <w:rFonts w:ascii="Courier New" w:hAnsi="Courier New"/>
+          <w:b/>
+        </w:rPr>
+        <w:t xml:space="preserve">  </w:t>
+      </w:r>
+      <w:r>
+        <w:t xml:space="preserve">ADR log — use the </w:t>
+      </w:r>
+      <w:proofErr w:type="spellStart"/>
+      <w:r>
+        <w:t>adr</w:t>
+      </w:r>
+      <w:proofErr w:type="spellEnd"/>
+      <w:r>
+        <w:t xml:space="preserve"> skill to append entries</w:t>
       </w:r>
     </w:p>
     <w:p/>
     <w:p>
-      <w:r>
-        <w:t>.ai/project.md  —  What this repo does, who uses it, key constraints  [auto-populated]</w:t>
+      <w:proofErr w:type="gramStart"/>
+      <w:r>
+        <w:t>.ai/project.md</w:t>
+      </w:r>
+      <w:proofErr w:type="gramEnd"/>
+      <w:r>
+        <w:t xml:space="preserve">  </w:t>
+      </w:r>
+      <w:proofErr w:type="gramStart"/>
+      <w:r>
+        <w:t>—  What</w:t>
+      </w:r>
+      <w:proofErr w:type="gramEnd"/>
+      <w:r>
+        <w:t xml:space="preserve"> this repo does, who uses it, key </w:t>
+      </w:r>
+      <w:proofErr w:type="gramStart"/>
+      <w:r>
+        <w:t>constraints  [</w:t>
+      </w:r>
+      <w:proofErr w:type="gramEnd"/>
+      <w:r>
+        <w:t>auto-populated]</w:t>
       </w:r>
     </w:p>
     <w:p/>
@@ -1893,16 +3071,32 @@
       <w:pPr>
         <w:pStyle w:val="Heading2"/>
       </w:pPr>
+      <w:proofErr w:type="gramStart"/>
       <w:r>
         <w:rPr>
           <w:color w:val="1A1A2E"/>
         </w:rPr>
-        <w:t>5.3  Architecture Decision Records (ADR)</w:t>
-      </w:r>
-    </w:p>
-    <w:p>
-      <w:r>
-        <w:t>Before any significant technical decision — choosing a framework, designing a data model, picking an infrastructure approach — use the adr skill:</w:t>
+        <w:t>5.3  Architecture</w:t>
+      </w:r>
+      <w:proofErr w:type="gramEnd"/>
+      <w:r>
+        <w:rPr>
+          <w:color w:val="1A1A2E"/>
+        </w:rPr>
+        <w:t xml:space="preserve"> Decision Records (ADR)</w:t>
+      </w:r>
+    </w:p>
+    <w:p>
+      <w:r>
+        <w:t xml:space="preserve">Before any significant technical decision — choosing a framework, designing a data model, picking an infrastructure approach — use the </w:t>
+      </w:r>
+      <w:proofErr w:type="spellStart"/>
+      <w:r>
+        <w:t>adr</w:t>
+      </w:r>
+      <w:proofErr w:type="spellEnd"/>
+      <w:r>
+        <w:t xml:space="preserve"> skill:</w:t>
       </w:r>
     </w:p>
     <w:p>
@@ -1932,7 +3126,25 @@
           <w:color w:val="24292F"/>
           <w:sz w:val="18"/>
         </w:rPr>
-        <w:t>Claude: [invokes adr skill] → enumerates options → evaluates tradeoffs → recommends</w:t>
+        <w:t xml:space="preserve">Claude: [invokes </w:t>
+      </w:r>
+      <w:proofErr w:type="spellStart"/>
+      <w:r>
+        <w:rPr>
+          <w:rFonts w:ascii="Courier New" w:hAnsi="Courier New"/>
+          <w:color w:val="24292F"/>
+          <w:sz w:val="18"/>
+        </w:rPr>
+        <w:t>adr</w:t>
+      </w:r>
+      <w:proofErr w:type="spellEnd"/>
+      <w:r>
+        <w:rPr>
+          <w:rFonts w:ascii="Courier New" w:hAnsi="Courier New"/>
+          <w:color w:val="24292F"/>
+          <w:sz w:val="18"/>
+        </w:rPr>
+        <w:t xml:space="preserve"> skill] → enumerates options → evaluates tradeoffs → recommends</w:t>
       </w:r>
     </w:p>
     <w:p>
@@ -1947,7 +3159,25 @@
           <w:color w:val="24292F"/>
           <w:sz w:val="18"/>
         </w:rPr>
-        <w:t xml:space="preserve">        → appends to .ai/decisions.md on approval</w:t>
+        <w:t xml:space="preserve">        → appends </w:t>
+      </w:r>
+      <w:proofErr w:type="gramStart"/>
+      <w:r>
+        <w:rPr>
+          <w:rFonts w:ascii="Courier New" w:hAnsi="Courier New"/>
+          <w:color w:val="24292F"/>
+          <w:sz w:val="18"/>
+        </w:rPr>
+        <w:t>to .</w:t>
+      </w:r>
+      <w:proofErr w:type="gramEnd"/>
+      <w:r>
+        <w:rPr>
+          <w:rFonts w:ascii="Courier New" w:hAnsi="Courier New"/>
+          <w:color w:val="24292F"/>
+          <w:sz w:val="18"/>
+        </w:rPr>
+        <w:t>ai/decisions.md on approval</w:t>
       </w:r>
     </w:p>
     <w:p>
@@ -1995,63 +3225,145 @@
       <w:pPr>
         <w:pStyle w:val="ListBullet"/>
       </w:pPr>
-      <w:r/>
-      <w:r>
-        <w:t>✅  .ai/ is initialized automatically on first use in any repo. Claude populates it from the codebase before your first message — nothing to do.</w:t>
+      <w:proofErr w:type="gramStart"/>
+      <w:r>
+        <w:t>✅  .</w:t>
+      </w:r>
+      <w:proofErr w:type="gramEnd"/>
+      <w:r>
+        <w:t>ai/ is initialized automatically on first use in any repo. Claude populates it from the codebase before your first message — nothing to do.</w:t>
       </w:r>
     </w:p>
     <w:p>
       <w:pPr>
         <w:pStyle w:val="ListBullet"/>
       </w:pPr>
-      <w:r>
-        <w:t>✅  Use /prd before any feature work. Even a 30-minute task benefits from explicit acceptance criteria.</w:t>
+      <w:proofErr w:type="gramStart"/>
+      <w:r>
+        <w:t>✅  Use</w:t>
+      </w:r>
+      <w:proofErr w:type="gramEnd"/>
+      <w:r>
+        <w:t xml:space="preserve"> /</w:t>
+      </w:r>
+      <w:proofErr w:type="spellStart"/>
+      <w:r>
+        <w:t>prd</w:t>
+      </w:r>
+      <w:proofErr w:type="spellEnd"/>
+      <w:r>
+        <w:t xml:space="preserve"> before any feature work. Even a 30-minute task benefits from explicit acceptance criteria.</w:t>
       </w:r>
     </w:p>
     <w:p>
       <w:pPr>
         <w:pStyle w:val="ListBullet"/>
       </w:pPr>
-      <w:r>
-        <w:t>✅  Let Claude commit. The</w:t>
+      <w:proofErr w:type="gramStart"/>
+      <w:r>
+        <w:t>✅  Let</w:t>
+      </w:r>
+      <w:proofErr w:type="gramEnd"/>
+      <w:r>
+        <w:t xml:space="preserve"> Claude commit. The</w:t>
       </w:r>
       <w:r>
         <w:t xml:space="preserve"> automated</w:t>
       </w:r>
       <w:r>
-        <w:t xml:space="preserve"> commit cadence in CLAUDE.md (every logical chunk) keeps history clean and bisectable.</w:t>
+        <w:t xml:space="preserve"> commit cadence in CLAUDE.md (every logical chunk) keeps history clean and </w:t>
+      </w:r>
+      <w:proofErr w:type="spellStart"/>
+      <w:r>
+        <w:t>bisectable</w:t>
+      </w:r>
+      <w:proofErr w:type="spellEnd"/>
+      <w:r>
+        <w:t>.</w:t>
       </w:r>
     </w:p>
     <w:p>
       <w:pPr>
         <w:pStyle w:val="ListBullet"/>
       </w:pPr>
-      <w:r>
-        <w:t>✅  Fill in your user_profile.md. Claude tailors explanation depth, analogies, and code style to your background.</w:t>
+      <w:proofErr w:type="gramStart"/>
+      <w:r>
+        <w:t>✅  Fill</w:t>
+      </w:r>
+      <w:proofErr w:type="gramEnd"/>
+      <w:r>
+        <w:t xml:space="preserve"> in your user_profile.md. Claude </w:t>
+      </w:r>
+      <w:proofErr w:type="gramStart"/>
+      <w:r>
+        <w:t>tailors</w:t>
+      </w:r>
+      <w:proofErr w:type="gramEnd"/>
+      <w:r>
+        <w:t xml:space="preserve"> explanation depth, analogies, and code style to your background.</w:t>
       </w:r>
     </w:p>
     <w:p>
       <w:pPr>
         <w:pStyle w:val="ListBullet"/>
       </w:pPr>
-      <w:r>
-        <w:t>.ai/tasks.md  —  Current sprint priorities and in-flight work  [auto-updated every 20 min]</w:t>
+      <w:proofErr w:type="gramStart"/>
+      <w:r>
+        <w:t>.ai/tasks.md</w:t>
+      </w:r>
+      <w:proofErr w:type="gramEnd"/>
+      <w:r>
+        <w:t xml:space="preserve">  </w:t>
+      </w:r>
+      <w:proofErr w:type="gramStart"/>
+      <w:r>
+        <w:t>—  Current</w:t>
+      </w:r>
+      <w:proofErr w:type="gramEnd"/>
+      <w:r>
+        <w:t xml:space="preserve"> sprint priorities and in-flight </w:t>
+      </w:r>
+      <w:proofErr w:type="gramStart"/>
+      <w:r>
+        <w:t>work  [</w:t>
+      </w:r>
+      <w:proofErr w:type="gramEnd"/>
+      <w:r>
+        <w:t>auto-updated every 20 min]</w:t>
       </w:r>
     </w:p>
     <w:p>
       <w:pPr>
         <w:pStyle w:val="ListBullet"/>
       </w:pPr>
-      <w:r>
-        <w:t>✅  Use "use the adr skill" before any architectural debate. Externalizes reasoning, creates a paper trail.</w:t>
+      <w:proofErr w:type="gramStart"/>
+      <w:r>
+        <w:t>✅  Use</w:t>
+      </w:r>
+      <w:proofErr w:type="gramEnd"/>
+      <w:r>
+        <w:t xml:space="preserve"> "use the </w:t>
+      </w:r>
+      <w:proofErr w:type="spellStart"/>
+      <w:r>
+        <w:t>adr</w:t>
+      </w:r>
+      <w:proofErr w:type="spellEnd"/>
+      <w:r>
+        <w:t xml:space="preserve"> skill" before any architectural debate. Externalizes reasoning, creates a paper trail.</w:t>
       </w:r>
     </w:p>
     <w:p>
       <w:pPr>
         <w:pStyle w:val="ListBullet"/>
       </w:pPr>
-      <w:r>
-        <w:t>✅  Trust the planning phase. Longer upfront plans = fewer mid-implementation pivots.</w:t>
+      <w:proofErr w:type="gramStart"/>
+      <w:r>
+        <w:t>✅  Trust</w:t>
+      </w:r>
+      <w:proofErr w:type="gramEnd"/>
+      <w:r>
+        <w:t xml:space="preserve"> the planning phase. Longer upfront plans = fewer mid-implementation pivots.</w:t>
       </w:r>
     </w:p>
     <w:p/>
@@ -2070,48 +3382,135 @@
       <w:pPr>
         <w:pStyle w:val="ListBullet"/>
       </w:pPr>
-      <w:r>
-        <w:t>⛔  Don't skip the PRD for 'quick' features. Scope creep starts with 'quick'.</w:t>
+      <w:proofErr w:type="gramStart"/>
+      <w:r>
+        <w:t>⛔  Don't</w:t>
+      </w:r>
+      <w:proofErr w:type="gramEnd"/>
+      <w:r>
+        <w:t xml:space="preserve"> skip the PRD for 'quick' features. Scope creep starts with 'quick'.</w:t>
       </w:r>
     </w:p>
     <w:p>
       <w:pPr>
         <w:pStyle w:val="ListBullet"/>
       </w:pPr>
-      <w:r>
-        <w:t>⛔  Don't commit .env or credentials. The deny list in settings.json prevents reads, but you still control commits.</w:t>
+      <w:proofErr w:type="gramStart"/>
+      <w:r>
+        <w:t>⛔  Don't</w:t>
+      </w:r>
+      <w:proofErr w:type="gramEnd"/>
+      <w:r>
+        <w:t xml:space="preserve"> </w:t>
+      </w:r>
+      <w:proofErr w:type="gramStart"/>
+      <w:r>
+        <w:t>commit .env</w:t>
+      </w:r>
+      <w:proofErr w:type="gramEnd"/>
+      <w:r>
+        <w:t xml:space="preserve"> or credentials. The deny list in </w:t>
+      </w:r>
+      <w:proofErr w:type="spellStart"/>
+      <w:proofErr w:type="gramStart"/>
+      <w:r>
+        <w:t>settings.json</w:t>
+      </w:r>
+      <w:proofErr w:type="spellEnd"/>
+      <w:proofErr w:type="gramEnd"/>
+      <w:r>
+        <w:t xml:space="preserve"> prevents reads, but you still control commits.</w:t>
       </w:r>
     </w:p>
     <w:p>
       <w:pPr>
         <w:pStyle w:val="ListBullet"/>
       </w:pPr>
-      <w:r>
-        <w:t>⛔  Don't force-push main. CLAUDE.md explicitly prohibits this — Claude will refuse.</w:t>
+      <w:proofErr w:type="gramStart"/>
+      <w:r>
+        <w:t>⛔  Don't</w:t>
+      </w:r>
+      <w:proofErr w:type="gramEnd"/>
+      <w:r>
+        <w:t xml:space="preserve"> force-push main. CLAUDE.md explicitly prohibits this — Claude will refuse.</w:t>
       </w:r>
     </w:p>
     <w:p>
       <w:pPr>
         <w:pStyle w:val="ListBullet"/>
       </w:pPr>
-      <w:r>
-        <w:t>⛔  Don't ignore Claude's plan-first suggestion. If it stops to plan, let it.</w:t>
+      <w:proofErr w:type="gramStart"/>
+      <w:r>
+        <w:t>⛔  Don't</w:t>
+      </w:r>
+      <w:proofErr w:type="gramEnd"/>
+      <w:r>
+        <w:t xml:space="preserve"> ignore Claude's plan-first suggestion. If it stops </w:t>
+      </w:r>
+      <w:proofErr w:type="gramStart"/>
+      <w:r>
+        <w:t>to plan</w:t>
+      </w:r>
+      <w:proofErr w:type="gramEnd"/>
+      <w:r>
+        <w:t>, let it.</w:t>
       </w:r>
     </w:p>
     <w:p>
       <w:pPr>
         <w:pStyle w:val="ListBullet"/>
       </w:pPr>
-      <w:r>
-        <w:t>⛔  Don't remove safety deny rules from settings.json. They exist for a reason.</w:t>
+      <w:proofErr w:type="gramStart"/>
+      <w:r>
+        <w:t>⛔  Don't</w:t>
+      </w:r>
+      <w:proofErr w:type="gramEnd"/>
+      <w:r>
+        <w:t xml:space="preserve"> remove safety deny rules from </w:t>
+      </w:r>
+      <w:proofErr w:type="spellStart"/>
+      <w:proofErr w:type="gramStart"/>
+      <w:r>
+        <w:t>settings.json</w:t>
+      </w:r>
+      <w:proofErr w:type="spellEnd"/>
+      <w:proofErr w:type="gramEnd"/>
+      <w:r>
+        <w:t>. They exist for a reason.</w:t>
       </w:r>
     </w:p>
     <w:p>
       <w:pPr>
         <w:pStyle w:val="ListBullet"/>
       </w:pPr>
-      <w:r>
-        <w:t>⛔  Don't share settings.local.json. It's gitignored intentionally — it's your local overrides.</w:t>
+      <w:proofErr w:type="gramStart"/>
+      <w:r>
+        <w:t>⛔  Don't</w:t>
+      </w:r>
+      <w:proofErr w:type="gramEnd"/>
+      <w:r>
+        <w:t xml:space="preserve"> share </w:t>
+      </w:r>
+      <w:proofErr w:type="spellStart"/>
+      <w:proofErr w:type="gramStart"/>
+      <w:r>
+        <w:t>settings.local</w:t>
+      </w:r>
+      <w:proofErr w:type="gramEnd"/>
+      <w:r>
+        <w:t>.json</w:t>
+      </w:r>
+      <w:proofErr w:type="spellEnd"/>
+      <w:r>
+        <w:t xml:space="preserve">. It's </w:t>
+      </w:r>
+      <w:proofErr w:type="spellStart"/>
+      <w:r>
+        <w:t>gitignored</w:t>
+      </w:r>
+      <w:proofErr w:type="spellEnd"/>
+      <w:r>
+        <w:t xml:space="preserve"> intentionally — it's your local overrides.</w:t>
       </w:r>
     </w:p>
     <w:p/>
@@ -2147,7 +3546,13 @@
         <w:pStyle w:val="ListNumber"/>
       </w:pPr>
       <w:r>
-        <w:t>Create a shared .ai/ template in your most-used repos. It takes 20 minutes and saves every engineer 20 minutes per session.</w:t>
+        <w:t>Create a shared .ai/ template in your most-used repos</w:t>
+      </w:r>
+      <w:r>
+        <w:t xml:space="preserve"> – make it part of your commit</w:t>
+      </w:r>
+      <w:r>
+        <w:t>. It takes 20 minutes and saves every engineer 20 minutes per session.</w:t>
       </w:r>
     </w:p>
     <w:p>
@@ -2163,7 +3568,28 @@
         <w:pStyle w:val="ListNumber"/>
       </w:pPr>
       <w:r>
-        <w:t>Share the .claude_on24template repo (not your ~/.claude). The template is what's shared; your personal memory stays local.</w:t>
+        <w:t xml:space="preserve">Share </w:t>
+      </w:r>
+      <w:proofErr w:type="gramStart"/>
+      <w:r>
+        <w:t>the .claude</w:t>
+      </w:r>
+      <w:proofErr w:type="gramEnd"/>
+      <w:r>
+        <w:t>_on24template repo (not your ~</w:t>
+      </w:r>
+      <w:proofErr w:type="gramStart"/>
+      <w:r>
+        <w:t>/.</w:t>
+      </w:r>
+      <w:proofErr w:type="spellStart"/>
+      <w:r>
+        <w:t>claude</w:t>
+      </w:r>
+      <w:proofErr w:type="spellEnd"/>
+      <w:proofErr w:type="gramEnd"/>
+      <w:r>
+        <w:t>). The template is what's shared; your personal memory stays local.</w:t>
       </w:r>
     </w:p>
     <w:p/>
@@ -2202,7 +3628,15 @@
     </w:p>
     <w:p>
       <w:r>
-        <w:t>Solution: Run: claude plugin install superpowers</w:t>
+        <w:t xml:space="preserve">Solution: Run: </w:t>
+      </w:r>
+      <w:proofErr w:type="spellStart"/>
+      <w:r>
+        <w:t>claude</w:t>
+      </w:r>
+      <w:proofErr w:type="spellEnd"/>
+      <w:r>
+        <w:t xml:space="preserve"> plugin install superpowers</w:t>
       </w:r>
       <w:r>
         <w:br/>
@@ -2215,12 +3649,68 @@
         <w:rPr>
           <w:b/>
         </w:rPr>
-        <w:t>Problem: Claude keeps asking permission for git/npm commands</w:t>
-      </w:r>
-    </w:p>
-    <w:p>
-      <w:r>
-        <w:t>Solution: Check settings.json → permissions → allow list. The defaultMode should be "dontAsk". If you're in a project with a local .claude/settings.json, it may be overriding the global one.</w:t>
+        <w:t>Problem: Claude keeps asking permission for git/</w:t>
+      </w:r>
+      <w:proofErr w:type="spellStart"/>
+      <w:r>
+        <w:rPr>
+          <w:b/>
+        </w:rPr>
+        <w:t>npm</w:t>
+      </w:r>
+      <w:proofErr w:type="spellEnd"/>
+      <w:r>
+        <w:rPr>
+          <w:b/>
+        </w:rPr>
+        <w:t xml:space="preserve"> commands</w:t>
+      </w:r>
+    </w:p>
+    <w:p>
+      <w:r>
+        <w:t xml:space="preserve">Solution: Check </w:t>
+      </w:r>
+      <w:proofErr w:type="spellStart"/>
+      <w:proofErr w:type="gramStart"/>
+      <w:r>
+        <w:t>settings.json</w:t>
+      </w:r>
+      <w:proofErr w:type="spellEnd"/>
+      <w:proofErr w:type="gramEnd"/>
+      <w:r>
+        <w:t xml:space="preserve"> → permissions → allow list. The </w:t>
+      </w:r>
+      <w:proofErr w:type="spellStart"/>
+      <w:r>
+        <w:t>defaultMode</w:t>
+      </w:r>
+      <w:proofErr w:type="spellEnd"/>
+      <w:r>
+        <w:t xml:space="preserve"> should be "</w:t>
+      </w:r>
+      <w:proofErr w:type="spellStart"/>
+      <w:r>
+        <w:t>dontAsk</w:t>
+      </w:r>
+      <w:proofErr w:type="spellEnd"/>
+      <w:r>
+        <w:t>". If you're in a project with a local .</w:t>
+      </w:r>
+      <w:proofErr w:type="spellStart"/>
+      <w:r>
+        <w:t>claude</w:t>
+      </w:r>
+      <w:proofErr w:type="spellEnd"/>
+      <w:r>
+        <w:t>/</w:t>
+      </w:r>
+      <w:proofErr w:type="spellStart"/>
+      <w:r>
+        <w:t>settings.json</w:t>
+      </w:r>
+      <w:proofErr w:type="spellEnd"/>
+      <w:r>
+        <w:t>, it may be overriding the global one.</w:t>
       </w:r>
     </w:p>
     <w:p/>
@@ -2234,7 +3724,31 @@
     </w:p>
     <w:p>
       <w:r>
-        <w:t>Solution: Check network access to github.com/anthropics/claude-plugins-official. If behind a corporate proxy, set HTTPS_PROXY env var before running claude plugin install.</w:t>
+        <w:t>Solution: Check network access to github.com/</w:t>
+      </w:r>
+      <w:proofErr w:type="spellStart"/>
+      <w:r>
+        <w:t>anthropics</w:t>
+      </w:r>
+      <w:proofErr w:type="spellEnd"/>
+      <w:r>
+        <w:t>/</w:t>
+      </w:r>
+      <w:proofErr w:type="spellStart"/>
+      <w:r>
+        <w:t>claude</w:t>
+      </w:r>
+      <w:proofErr w:type="spellEnd"/>
+      <w:r>
+        <w:t xml:space="preserve">-plugins-official. If behind a corporate proxy, set HTTPS_PROXY env var before running </w:t>
+      </w:r>
+      <w:proofErr w:type="spellStart"/>
+      <w:r>
+        <w:t>claude</w:t>
+      </w:r>
+      <w:proofErr w:type="spellEnd"/>
+      <w:r>
+        <w:t xml:space="preserve"> plugin install.</w:t>
       </w:r>
     </w:p>
     <w:p/>
@@ -2243,12 +3757,47 @@
         <w:rPr>
           <w:b/>
         </w:rPr>
-        <w:t>Problem: /prd command not recognized</w:t>
-      </w:r>
-    </w:p>
-    <w:p>
-      <w:r>
-        <w:t>Solution: Verify ~/.claude/commands/prd.md exists. Run: ls ~/.claude/commands/</w:t>
+        <w:t>Problem: /</w:t>
+      </w:r>
+      <w:proofErr w:type="spellStart"/>
+      <w:r>
+        <w:rPr>
+          <w:b/>
+        </w:rPr>
+        <w:t>prd</w:t>
+      </w:r>
+      <w:proofErr w:type="spellEnd"/>
+      <w:r>
+        <w:rPr>
+          <w:b/>
+        </w:rPr>
+        <w:t xml:space="preserve"> command not recognized</w:t>
+      </w:r>
+    </w:p>
+    <w:p>
+      <w:r>
+        <w:t>Solution: Verify ~</w:t>
+      </w:r>
+      <w:proofErr w:type="gramStart"/>
+      <w:r>
+        <w:t>/.claude/commands/prd.md</w:t>
+      </w:r>
+      <w:proofErr w:type="gramEnd"/>
+      <w:r>
+        <w:t xml:space="preserve"> exists. Run: ls ~</w:t>
+      </w:r>
+      <w:proofErr w:type="gramStart"/>
+      <w:r>
+        <w:t>/.</w:t>
+      </w:r>
+      <w:proofErr w:type="spellStart"/>
+      <w:r>
+        <w:t>claude</w:t>
+      </w:r>
+      <w:proofErr w:type="spellEnd"/>
+      <w:proofErr w:type="gramEnd"/>
+      <w:r>
+        <w:t>/commands/</w:t>
       </w:r>
     </w:p>
     <w:p/>
@@ -2262,7 +3811,15 @@
     </w:p>
     <w:p>
       <w:r>
-        <w:t>Solution: CLAUDE.md at ~/.claude/CLAUDE.md is global. If a project has its own CLAUDE.md it may override. Check the project root for a conflicting CLAUDE.md.</w:t>
+        <w:t>Solution: CLAUDE.md at ~</w:t>
+      </w:r>
+      <w:proofErr w:type="gramStart"/>
+      <w:r>
+        <w:t>/.claude/CLAUDE.md</w:t>
+      </w:r>
+      <w:proofErr w:type="gramEnd"/>
+      <w:r>
+        <w:t xml:space="preserve"> is global. If a project has its own CLAUDE.md it may override. Check the project root for a conflicting CLAUDE.md.</w:t>
       </w:r>
     </w:p>
     <w:p/>
@@ -2271,25 +3828,123 @@
         <w:rPr>
           <w:b/>
         </w:rPr>
-        <w:t>Problem: settings.local.json overriding settings.json unexpectedly</w:t>
-      </w:r>
-    </w:p>
-    <w:p>
-      <w:r>
-        <w:t>Solution: settings.local.json takes precedence. Check its contents: cat ~/.claude/settings.local.json</w:t>
-      </w:r>
-    </w:p>
-    <w:p>
+        <w:t xml:space="preserve">Problem: </w:t>
+      </w:r>
+      <w:proofErr w:type="spellStart"/>
+      <w:proofErr w:type="gramStart"/>
       <w:r>
         <w:rPr>
           <w:b/>
         </w:rPr>
+        <w:t>settings.local</w:t>
+      </w:r>
+      <w:proofErr w:type="gramEnd"/>
+      <w:r>
+        <w:rPr>
+          <w:b/>
+        </w:rPr>
+        <w:t>.json</w:t>
+      </w:r>
+      <w:proofErr w:type="spellEnd"/>
+      <w:r>
+        <w:rPr>
+          <w:b/>
+        </w:rPr>
+        <w:t xml:space="preserve"> overriding </w:t>
+      </w:r>
+      <w:proofErr w:type="spellStart"/>
+      <w:proofErr w:type="gramStart"/>
+      <w:r>
+        <w:rPr>
+          <w:b/>
+        </w:rPr>
+        <w:t>settings.json</w:t>
+      </w:r>
+      <w:proofErr w:type="spellEnd"/>
+      <w:proofErr w:type="gramEnd"/>
+      <w:r>
+        <w:rPr>
+          <w:b/>
+        </w:rPr>
+        <w:t xml:space="preserve"> unexpectedly</w:t>
+      </w:r>
+    </w:p>
+    <w:p>
+      <w:r>
+        <w:t xml:space="preserve">Solution: </w:t>
+      </w:r>
+      <w:proofErr w:type="spellStart"/>
+      <w:proofErr w:type="gramStart"/>
+      <w:r>
+        <w:t>settings.local</w:t>
+      </w:r>
+      <w:proofErr w:type="gramEnd"/>
+      <w:r>
+        <w:t>.json</w:t>
+      </w:r>
+      <w:proofErr w:type="spellEnd"/>
+      <w:r>
+        <w:t xml:space="preserve"> takes precedence. Check its contents: cat ~/.</w:t>
+      </w:r>
+      <w:proofErr w:type="spellStart"/>
+      <w:r>
+        <w:t>claude</w:t>
+      </w:r>
+      <w:proofErr w:type="spellEnd"/>
+      <w:r>
+        <w:t>/</w:t>
+      </w:r>
+      <w:proofErr w:type="spellStart"/>
+      <w:r>
+        <w:t>settings.local.json</w:t>
+      </w:r>
+      <w:proofErr w:type="spellEnd"/>
+    </w:p>
+    <w:p>
+      <w:r>
+        <w:rPr>
+          <w:b/>
+        </w:rPr>
         <w:t>Problem: .ai/ not being created automatically / tasks.md not updating</w:t>
       </w:r>
     </w:p>
     <w:p>
       <w:r>
-        <w:t>Solution: Check that hooks-handlers/init-ai.sh is executable (chmod +x ~/.claude/hooks-handlers/init-ai.sh) and that settings.json contains the SessionStart hook entry. The hook requires python3 to be on PATH for JSON escaping. Test manually: bash ~/.claude/hooks-handlers/init-ai.sh</w:t>
+        <w:t>Solution: Check that hooks-handlers/init-ai.sh is executable (</w:t>
+      </w:r>
+      <w:proofErr w:type="spellStart"/>
+      <w:r>
+        <w:t>chmod</w:t>
+      </w:r>
+      <w:proofErr w:type="spellEnd"/>
+      <w:r>
+        <w:t xml:space="preserve"> +x ~/.</w:t>
+      </w:r>
+      <w:proofErr w:type="spellStart"/>
+      <w:r>
+        <w:t>claude</w:t>
+      </w:r>
+      <w:proofErr w:type="spellEnd"/>
+      <w:r>
+        <w:t xml:space="preserve">/hooks-handlers/init-ai.sh) and that </w:t>
+      </w:r>
+      <w:proofErr w:type="spellStart"/>
+      <w:proofErr w:type="gramStart"/>
+      <w:r>
+        <w:t>settings.json</w:t>
+      </w:r>
+      <w:proofErr w:type="spellEnd"/>
+      <w:proofErr w:type="gramEnd"/>
+      <w:r>
+        <w:t xml:space="preserve"> contains the </w:t>
+      </w:r>
+      <w:proofErr w:type="spellStart"/>
+      <w:r>
+        <w:t>SessionStart</w:t>
+      </w:r>
+      <w:proofErr w:type="spellEnd"/>
+      <w:r>
+        <w:t xml:space="preserve"> hook entry. The hook requires python3 to be on PATH for JSON escaping. Test manually: bash ~/.claude/hooks-handlers/init-ai.sh</w:t>
       </w:r>
     </w:p>
     <w:p/>
@@ -2308,7 +3963,6 @@
         <w:rPr>
           <w:color w:val="0047AB"/>
         </w:rPr>
-        <w:lastRenderedPageBreak/>
         <w:t>8. Quick Reference</w:t>
       </w:r>
     </w:p>
@@ -2370,8 +4024,13 @@
           </w:tcPr>
           <w:p>
             <w:r>
-              <w:t>~/.claude/CLAUDE.md</w:t>
+              <w:t>~</w:t>
             </w:r>
+            <w:proofErr w:type="gramStart"/>
+            <w:r>
+              <w:t>/.claude/CLAUDE.md</w:t>
+            </w:r>
+            <w:proofErr w:type="gramEnd"/>
           </w:p>
         </w:tc>
         <w:tc>
@@ -2392,8 +4051,21 @@
           </w:tcPr>
           <w:p>
             <w:r>
-              <w:t>~/.claude/settings.json</w:t>
+              <w:t>~/.</w:t>
             </w:r>
+            <w:proofErr w:type="spellStart"/>
+            <w:r>
+              <w:t>claude</w:t>
+            </w:r>
+            <w:proofErr w:type="spellEnd"/>
+            <w:r>
+              <w:t>/</w:t>
+            </w:r>
+            <w:proofErr w:type="spellStart"/>
+            <w:r>
+              <w:t>settings.json</w:t>
+            </w:r>
+            <w:proofErr w:type="spellEnd"/>
           </w:p>
         </w:tc>
         <w:tc>
@@ -2414,8 +4086,13 @@
           </w:tcPr>
           <w:p>
             <w:r>
-              <w:t>~/.claude/projects/template/memory/user_profile.md</w:t>
+              <w:t>~</w:t>
             </w:r>
+            <w:proofErr w:type="gramStart"/>
+            <w:r>
+              <w:t>/.claude/projects/template/memory/user_profile.md</w:t>
+            </w:r>
+            <w:proofErr w:type="gramEnd"/>
           </w:p>
         </w:tc>
         <w:tc>
@@ -2436,8 +4113,13 @@
           </w:tcPr>
           <w:p>
             <w:r>
-              <w:t>&lt;repo&gt;/.ai/project.md</w:t>
+              <w:t>&lt;repo&gt;</w:t>
             </w:r>
+            <w:proofErr w:type="gramStart"/>
+            <w:r>
+              <w:t>/.ai/project.md</w:t>
+            </w:r>
+            <w:proofErr w:type="gramEnd"/>
           </w:p>
         </w:tc>
         <w:tc>
@@ -2458,8 +4140,13 @@
           </w:tcPr>
           <w:p>
             <w:r>
-              <w:t>&lt;repo&gt;/.ai/decisions.md</w:t>
+              <w:t>&lt;repo&gt;</w:t>
             </w:r>
+            <w:proofErr w:type="gramStart"/>
+            <w:r>
+              <w:t>/.ai/decisions.md</w:t>
+            </w:r>
+            <w:proofErr w:type="gramEnd"/>
           </w:p>
         </w:tc>
         <w:tc>
@@ -2468,7 +4155,15 @@
           </w:tcPr>
           <w:p>
             <w:r>
-              <w:t>ADR log — maintained by adr skill</w:t>
+              <w:t xml:space="preserve">ADR log — maintained by </w:t>
+            </w:r>
+            <w:proofErr w:type="spellStart"/>
+            <w:r>
+              <w:t>adr</w:t>
+            </w:r>
+            <w:proofErr w:type="spellEnd"/>
+            <w:r>
+              <w:t xml:space="preserve"> skill</w:t>
             </w:r>
           </w:p>
         </w:tc>
@@ -2480,7 +4175,15 @@
           </w:tcPr>
           <w:p>
             <w:r>
-              <w:t>&lt;repo&gt;/docs/prd/</w:t>
+              <w:t>&lt;repo&gt;/docs/</w:t>
+            </w:r>
+            <w:proofErr w:type="spellStart"/>
+            <w:r>
+              <w:t>prd</w:t>
+            </w:r>
+            <w:proofErr w:type="spellEnd"/>
+            <w:r>
+              <w:t>/</w:t>
             </w:r>
           </w:p>
         </w:tc>
@@ -2490,7 +4193,15 @@
           </w:tcPr>
           <w:p>
             <w:r>
-              <w:t>PRD documents — maintained by prd skill</w:t>
+              <w:t xml:space="preserve">PRD documents — maintained by </w:t>
+            </w:r>
+            <w:proofErr w:type="spellStart"/>
+            <w:r>
+              <w:t>prd</w:t>
+            </w:r>
+            <w:proofErr w:type="spellEnd"/>
+            <w:r>
+              <w:t xml:space="preserve"> skill</w:t>
             </w:r>
           </w:p>
         </w:tc>
@@ -2542,7 +4253,7 @@
       <w:tr>
         <w:tc>
           <w:tcPr>
-            <w:tcW w:type="dxa" w:w="5434"/>
+            <w:tcW w:w="5434" w:type="dxa"/>
           </w:tcPr>
           <w:p>
             <w:r>
@@ -2552,11 +4263,24 @@
         </w:tc>
         <w:tc>
           <w:tcPr>
-            <w:tcW w:type="dxa" w:w="3566"/>
+            <w:tcW w:w="3566" w:type="dxa"/>
           </w:tcPr>
           <w:p>
+            <w:proofErr w:type="spellStart"/>
             <w:r>
-              <w:t>SessionStart hook — auto-inits .ai/, schedules 20-min tasks sync</w:t>
+              <w:t>SessionStart</w:t>
+            </w:r>
+            <w:proofErr w:type="spellEnd"/>
+            <w:r>
+              <w:t xml:space="preserve"> hook — auto-</w:t>
+            </w:r>
+            <w:proofErr w:type="spellStart"/>
+            <w:r>
+              <w:t>inits</w:t>
+            </w:r>
+            <w:proofErr w:type="spellEnd"/>
+            <w:r>
+              <w:t xml:space="preserve"> .ai/, schedules 20-min tasks sync</w:t>
             </w:r>
           </w:p>
         </w:tc>
@@ -2578,75 +4302,230 @@
       <w:pPr>
         <w:ind w:left="432"/>
       </w:pPr>
+      <w:proofErr w:type="spellStart"/>
       <w:r>
         <w:rPr>
           <w:rFonts w:ascii="Courier New" w:hAnsi="Courier New"/>
           <w:b/>
         </w:rPr>
-        <w:t>claude plugin install &lt;name&gt;</w:t>
-      </w:r>
-      <w:r>
-        <w:t xml:space="preserve">  —  Install a plugin</w:t>
-      </w:r>
-    </w:p>
-    <w:p>
-      <w:pPr>
-        <w:ind w:left="432"/>
-      </w:pPr>
+        <w:t>claude</w:t>
+      </w:r>
+      <w:proofErr w:type="spellEnd"/>
       <w:r>
         <w:rPr>
           <w:rFonts w:ascii="Courier New" w:hAnsi="Courier New"/>
           <w:b/>
         </w:rPr>
-        <w:t>claude plugin list</w:t>
-      </w:r>
-      <w:r>
-        <w:t xml:space="preserve">  —  List installed plugins</w:t>
-      </w:r>
-    </w:p>
-    <w:p>
-      <w:pPr>
-        <w:ind w:left="432"/>
-      </w:pPr>
+        <w:t xml:space="preserve"> plugin install &lt;name</w:t>
+      </w:r>
+      <w:proofErr w:type="gramStart"/>
       <w:r>
         <w:rPr>
           <w:rFonts w:ascii="Courier New" w:hAnsi="Courier New"/>
           <w:b/>
         </w:rPr>
-        <w:t>/prd</w:t>
-      </w:r>
-      <w:r>
-        <w:t xml:space="preserve">  —  Start a PRD session</w:t>
+        <w:t>&gt;</w:t>
+      </w:r>
+      <w:r>
+        <w:t xml:space="preserve">  —</w:t>
+      </w:r>
+      <w:proofErr w:type="gramEnd"/>
+      <w:r>
+        <w:t xml:space="preserve">  Install a plugin</w:t>
       </w:r>
     </w:p>
     <w:p>
       <w:pPr>
         <w:ind w:left="432"/>
       </w:pPr>
+      <w:proofErr w:type="spellStart"/>
       <w:r>
         <w:rPr>
           <w:rFonts w:ascii="Courier New" w:hAnsi="Courier New"/>
           <w:b/>
         </w:rPr>
-        <w:t>"use the adr skill"</w:t>
-      </w:r>
-      <w:r>
-        <w:t xml:space="preserve">  —  Document an architecture decision</w:t>
-      </w:r>
-    </w:p>
-    <w:p>
-      <w:pPr>
-        <w:ind w:left="432"/>
-      </w:pPr>
+        <w:t>claude</w:t>
+      </w:r>
+      <w:proofErr w:type="spellEnd"/>
       <w:r>
         <w:rPr>
           <w:rFonts w:ascii="Courier New" w:hAnsi="Courier New"/>
           <w:b/>
         </w:rPr>
-        <w:t>.ai/project.md  —  What this repo does, who uses it, key constraints  [auto-populated]</w:t>
-      </w:r>
-      <w:r>
-        <w:t xml:space="preserve">  —  Load project context at session start</w:t>
+        <w:t xml:space="preserve"> plugin </w:t>
+      </w:r>
+      <w:proofErr w:type="gramStart"/>
+      <w:r>
+        <w:rPr>
+          <w:rFonts w:ascii="Courier New" w:hAnsi="Courier New"/>
+          <w:b/>
+        </w:rPr>
+        <w:t>list</w:t>
+      </w:r>
+      <w:r>
+        <w:t xml:space="preserve">  —</w:t>
+      </w:r>
+      <w:proofErr w:type="gramEnd"/>
+      <w:r>
+        <w:t xml:space="preserve">  List installed plugins</w:t>
+      </w:r>
+    </w:p>
+    <w:p>
+      <w:pPr>
+        <w:ind w:left="432"/>
+      </w:pPr>
+      <w:r>
+        <w:rPr>
+          <w:rFonts w:ascii="Courier New" w:hAnsi="Courier New"/>
+          <w:b/>
+        </w:rPr>
+        <w:t>/</w:t>
+      </w:r>
+      <w:proofErr w:type="spellStart"/>
+      <w:proofErr w:type="gramStart"/>
+      <w:r>
+        <w:rPr>
+          <w:rFonts w:ascii="Courier New" w:hAnsi="Courier New"/>
+          <w:b/>
+        </w:rPr>
+        <w:t>prd</w:t>
+      </w:r>
+      <w:proofErr w:type="spellEnd"/>
+      <w:r>
+        <w:t xml:space="preserve">  —</w:t>
+      </w:r>
+      <w:proofErr w:type="gramEnd"/>
+      <w:r>
+        <w:t xml:space="preserve">  Start a PRD session</w:t>
+      </w:r>
+    </w:p>
+    <w:p>
+      <w:pPr>
+        <w:ind w:left="432"/>
+      </w:pPr>
+      <w:r>
+        <w:rPr>
+          <w:rFonts w:ascii="Courier New" w:hAnsi="Courier New"/>
+          <w:b/>
+        </w:rPr>
+        <w:t>"</w:t>
+      </w:r>
+      <w:proofErr w:type="gramStart"/>
+      <w:r>
+        <w:rPr>
+          <w:rFonts w:ascii="Courier New" w:hAnsi="Courier New"/>
+          <w:b/>
+        </w:rPr>
+        <w:t>use</w:t>
+      </w:r>
+      <w:proofErr w:type="gramEnd"/>
+      <w:r>
+        <w:rPr>
+          <w:rFonts w:ascii="Courier New" w:hAnsi="Courier New"/>
+          <w:b/>
+        </w:rPr>
+        <w:t xml:space="preserve"> the </w:t>
+      </w:r>
+      <w:proofErr w:type="spellStart"/>
+      <w:proofErr w:type="gramStart"/>
+      <w:r>
+        <w:rPr>
+          <w:rFonts w:ascii="Courier New" w:hAnsi="Courier New"/>
+          <w:b/>
+        </w:rPr>
+        <w:t>adr</w:t>
+      </w:r>
+      <w:proofErr w:type="spellEnd"/>
+      <w:proofErr w:type="gramEnd"/>
+      <w:r>
+        <w:rPr>
+          <w:rFonts w:ascii="Courier New" w:hAnsi="Courier New"/>
+          <w:b/>
+        </w:rPr>
+        <w:t xml:space="preserve"> skill</w:t>
+      </w:r>
+      <w:proofErr w:type="gramStart"/>
+      <w:r>
+        <w:rPr>
+          <w:rFonts w:ascii="Courier New" w:hAnsi="Courier New"/>
+          <w:b/>
+        </w:rPr>
+        <w:t>"</w:t>
+      </w:r>
+      <w:r>
+        <w:t xml:space="preserve">  —</w:t>
+      </w:r>
+      <w:proofErr w:type="gramEnd"/>
+      <w:r>
+        <w:t xml:space="preserve">  Document an architecture decision</w:t>
+      </w:r>
+    </w:p>
+    <w:p>
+      <w:pPr>
+        <w:ind w:left="432"/>
+      </w:pPr>
+      <w:proofErr w:type="gramStart"/>
+      <w:r>
+        <w:rPr>
+          <w:rFonts w:ascii="Courier New" w:hAnsi="Courier New"/>
+          <w:b/>
+        </w:rPr>
+        <w:t>.ai/project.md</w:t>
+      </w:r>
+      <w:proofErr w:type="gramEnd"/>
+      <w:r>
+        <w:rPr>
+          <w:rFonts w:ascii="Courier New" w:hAnsi="Courier New"/>
+          <w:b/>
+        </w:rPr>
+        <w:t xml:space="preserve">  </w:t>
+      </w:r>
+      <w:proofErr w:type="gramStart"/>
+      <w:r>
+        <w:rPr>
+          <w:rFonts w:ascii="Courier New" w:hAnsi="Courier New"/>
+          <w:b/>
+        </w:rPr>
+        <w:t>—  What</w:t>
+      </w:r>
+      <w:proofErr w:type="gramEnd"/>
+      <w:r>
+        <w:rPr>
+          <w:rFonts w:ascii="Courier New" w:hAnsi="Courier New"/>
+          <w:b/>
+        </w:rPr>
+        <w:t xml:space="preserve"> this repo does, who uses it, key </w:t>
+      </w:r>
+      <w:proofErr w:type="gramStart"/>
+      <w:r>
+        <w:rPr>
+          <w:rFonts w:ascii="Courier New" w:hAnsi="Courier New"/>
+          <w:b/>
+        </w:rPr>
+        <w:t>constraints  [</w:t>
+      </w:r>
+      <w:proofErr w:type="gramEnd"/>
+      <w:r>
+        <w:rPr>
+          <w:rFonts w:ascii="Courier New" w:hAnsi="Courier New"/>
+          <w:b/>
+        </w:rPr>
+        <w:t>auto-</w:t>
+      </w:r>
+      <w:proofErr w:type="gramStart"/>
+      <w:r>
+        <w:rPr>
+          <w:rFonts w:ascii="Courier New" w:hAnsi="Courier New"/>
+          <w:b/>
+        </w:rPr>
+        <w:t>populated]</w:t>
+      </w:r>
+      <w:r>
+        <w:t xml:space="preserve">  —</w:t>
+      </w:r>
+      <w:proofErr w:type="gramEnd"/>
+      <w:r>
+        <w:t xml:space="preserve">  Load project context at session start</w:t>
       </w:r>
     </w:p>
     <w:p/>
@@ -2696,7 +4575,43 @@
           <w:color w:val="AAAAAA"/>
           <w:sz w:val="18"/>
         </w:rPr>
-        <w:t>ON24 Engineering  ·  Claude Code Onboarding Guide  ·  2026</w:t>
+        <w:t xml:space="preserve">ON24 </w:t>
+      </w:r>
+      <w:proofErr w:type="gramStart"/>
+      <w:r>
+        <w:rPr>
+          <w:i/>
+          <w:color w:val="AAAAAA"/>
+          <w:sz w:val="18"/>
+        </w:rPr>
+        <w:t>Engineering  ·</w:t>
+      </w:r>
+      <w:proofErr w:type="gramEnd"/>
+      <w:r>
+        <w:rPr>
+          <w:i/>
+          <w:color w:val="AAAAAA"/>
+          <w:sz w:val="18"/>
+        </w:rPr>
+        <w:t xml:space="preserve">  Claude Code Onboarding </w:t>
+      </w:r>
+      <w:proofErr w:type="gramStart"/>
+      <w:r>
+        <w:rPr>
+          <w:i/>
+          <w:color w:val="AAAAAA"/>
+          <w:sz w:val="18"/>
+        </w:rPr>
+        <w:t>Guide  ·</w:t>
+      </w:r>
+      <w:proofErr w:type="gramEnd"/>
+      <w:r>
+        <w:rPr>
+          <w:i/>
+          <w:color w:val="AAAAAA"/>
+          <w:sz w:val="18"/>
+        </w:rPr>
+        <w:t xml:space="preserve">  2026</w:t>
       </w:r>
     </w:p>
     <w:sectPr>
@@ -2846,7 +4761,7 @@
   <w:abstractNum w:abstractNumId="7" w15:restartNumberingAfterBreak="0">
     <w:nsid w:val="FFFFFF88"/>
     <w:multiLevelType w:val="singleLevel"/>
-    <w:tmpl w:val="D0A62B40"/>
+    <w:tmpl w:val="7A685BEA"/>
     <w:lvl w:ilvl="0">
       <w:start w:val="1"/>
       <w:numFmt w:val="decimal"/>
@@ -2908,6 +4823,12 @@
   </w:num>
   <w:num w:numId="9" w16cid:durableId="227035366">
     <w:abstractNumId w:val="0"/>
+  </w:num>
+  <w:num w:numId="10" w16cid:durableId="1501198192">
+    <w:abstractNumId w:val="7"/>
+  </w:num>
+  <w:num w:numId="11" w16cid:durableId="1614171265">
+    <w:abstractNumId w:val="7"/>
   </w:num>
 </w:numbering>
 </file>

</xml_diff>

<commit_message>
Add example-ai/ to onboarding doc
Mentioned in file tree, What's Included table, Section 5.2 repo memory
callout, and Quick Reference table.

Co-Authored-By: Claude Sonnet 4.6 <noreply@anthropic.com>
</commit_message>
<xml_diff>
--- a/ON24 Claude Code Onboarding Guide.docx
+++ b/ON24 Claude Code Onboarding Guide.docx
@@ -811,6 +811,61 @@
         <w:shd w:val="clear" w:color="auto" w:fill="F3F4F6"/>
         <w:spacing w:before="40" w:after="40"/>
         <w:ind w:left="576"/>
+        <w:shd w:val="clear" w:color="auto" w:fill="F3F4F6"/>
+      </w:pPr>
+      <w:r>
+        <w:rPr>
+          <w:rFonts w:ascii="Courier New" w:hAnsi="Courier New"/>
+          <w:color w:val="24292F"/>
+          <w:sz w:val="18"/>
+        </w:rPr>
+      </w:r>
+      <w:proofErr w:type="spellStart"/>
+      <w:r>
+        <w:rPr>
+          <w:rFonts w:ascii="Courier New" w:hAnsi="Courier New"/>
+          <w:color w:val="24292F"/>
+          <w:sz w:val="18"/>
+        </w:rPr>
+      </w:r>
+      <w:proofErr w:type="spellEnd"/>
+      <w:r>
+        <w:rPr>
+          <w:rFonts w:ascii="Courier New" w:hAnsi="Courier New"/>
+          <w:color w:val="24292F"/>
+          <w:sz w:val="18"/>
+        </w:rPr>
+      </w:r>
+      <w:proofErr w:type="spellStart"/>
+      <w:r>
+        <w:rPr>
+          <w:rFonts w:ascii="Courier New" w:hAnsi="Courier New"/>
+          <w:color w:val="24292F"/>
+          <w:sz w:val="18"/>
+        </w:rPr>
+      </w:r>
+      <w:proofErr w:type="spellEnd"/>
+      <w:r>
+        <w:rPr>
+          <w:rFonts w:ascii="Courier New" w:hAnsi="Courier New"/>
+          <w:color w:val="24292F"/>
+          <w:sz w:val="18"/>
+        </w:rPr>
+      </w:r>
+      <w:r>
+        <w:rPr>
+          <w:rFonts w:ascii="Courier New" w:hAnsi="Courier New"/>
+          <w:color w:val="24292F"/>
+          <w:sz w:val="18"/>
+        </w:rPr>
+        <w:t>└── example-ai/                    ← Annotated .ai/ templates to copy into any repo</w:t>
+      </w:r>
+    </w:p>
+    <w:p>
+      <w:pPr>
+        <w:shd w:val="clear" w:color="auto" w:fill="F3F4F6"/>
+        <w:spacing w:before="40" w:after="40"/>
+        <w:ind w:left="576"/>
       </w:pPr>
       <w:r>
         <w:rPr>
@@ -1246,6 +1301,62 @@
         <w:tc>
           <w:tcPr>
             <w:tcW w:w="2928" w:type="dxa"/>
+          </w:tcPr>
+          <w:p/>
+        </w:tc>
+      </w:tr>
+      <w:tr>
+        <w:tc>
+          <w:tcPr>
+            <w:tcW w:type="dxa" w:w="2928"/>
+          </w:tcPr>
+          <w:p>
+            <w:r>
+              <w:t>example-ai/</w:t>
+            </w:r>
+          </w:p>
+        </w:tc>
+        <w:tc>
+          <w:tcPr>
+            <w:tcW w:type="dxa" w:w="2928"/>
+          </w:tcPr>
+          <w:p>
+            <w:r>
+              <w:t>Annotated .ai/ templates (project, architecture, commands, tasks, decisions) — copy to any repo as .ai/</w:t>
+            </w:r>
+          </w:p>
+        </w:tc>
+        <w:tc>
+          <w:tcPr>
+            <w:tcW w:type="dxa" w:w="2928"/>
+          </w:tcPr>
+          <w:p/>
+        </w:tc>
+      </w:tr>
+      <w:tr>
+        <w:tc>
+          <w:tcPr>
+            <w:tcW w:type="dxa" w:w="2928"/>
+          </w:tcPr>
+          <w:p>
+            <w:r>
+              <w:t>example-ai/</w:t>
+            </w:r>
+          </w:p>
+        </w:tc>
+        <w:tc>
+          <w:tcPr>
+            <w:tcW w:type="dxa" w:w="2928"/>
+          </w:tcPr>
+          <w:p>
+            <w:r>
+              <w:t>Annotated .ai/ templates — copy to repo root as .ai/ to skip cold-start</w:t>
+            </w:r>
+          </w:p>
+        </w:tc>
+        <w:tc>
+          <w:tcPr>
+            <w:tcW w:type="dxa" w:w="2928"/>
           </w:tcPr>
           <w:p/>
         </w:tc>
@@ -3005,6 +3116,22 @@
       <w:proofErr w:type="gramEnd"/>
       <w:r>
         <w:t xml:space="preserve"> sprint priorities and in-flight work</w:t>
+      </w:r>
+    </w:p>
+    <w:p>
+      <w:pPr>
+        <w:ind w:left="432"/>
+        <w:shd w:val="clear" w:color="auto" w:fill="EBF3FB"/>
+      </w:pPr>
+      <w:r>
+        <w:rPr>
+          <w:b/>
+          <w:color w:val="0047AB"/>
+        </w:rPr>
+        <w:t xml:space="preserve">COPY TO GET STARTED FAST  </w:t>
+      </w:r>
+      <w:r>
+        <w:t>The template ships with example-ai/ — six annotated files showing the expected format and depth. Copy to any repo as .ai/ and either fill manually or ask Claude: "Read the codebase and fill in .ai/project.md, .ai/architecture.md, and .ai/commands.md"</w:t>
       </w:r>
     </w:p>
     <w:p>
@@ -4281,6 +4408,50 @@
             <w:proofErr w:type="spellEnd"/>
             <w:r>
               <w:t xml:space="preserve"> .ai/, schedules 20-min tasks sync</w:t>
+            </w:r>
+          </w:p>
+        </w:tc>
+      </w:tr>
+      <w:tr>
+        <w:tc>
+          <w:tcPr>
+            <w:tcW w:type="dxa" w:w="5434"/>
+          </w:tcPr>
+          <w:p>
+            <w:r>
+              <w:t>example-ai/</w:t>
+            </w:r>
+          </w:p>
+        </w:tc>
+        <w:tc>
+          <w:tcPr>
+            <w:tcW w:type="dxa" w:w="3566"/>
+          </w:tcPr>
+          <w:p>
+            <w:r>
+              <w:t>Annotated .ai/ templates (project, architecture, commands, tasks, decisions) — copy to any repo as .ai/</w:t>
+            </w:r>
+          </w:p>
+        </w:tc>
+      </w:tr>
+      <w:tr>
+        <w:tc>
+          <w:tcPr>
+            <w:tcW w:type="dxa" w:w="5434"/>
+          </w:tcPr>
+          <w:p>
+            <w:r>
+              <w:t>example-ai/</w:t>
+            </w:r>
+          </w:p>
+        </w:tc>
+        <w:tc>
+          <w:tcPr>
+            <w:tcW w:type="dxa" w:w="3566"/>
+          </w:tcPr>
+          <w:p>
+            <w:r>
+              <w:t>Annotated .ai/ templates — copy to repo root as .ai/ to skip cold-start</w:t>
             </w:r>
           </w:p>
         </w:tc>

</xml_diff>

<commit_message>
Add plugin/skill evangelism to onboarding doc, remove Slack plugin
- Added "why and when to use" descriptions for all 5 plugins and 3
  custom skills/commands in the Word doc
- Removed Slack plugin references from doc, settings.json, and README

Co-Authored-By: Claude Opus 4.6 (1M context) <noreply@anthropic.com>
</commit_message>
<xml_diff>
--- a/ON24 Claude Code Onboarding Guide.docx
+++ b/ON24 Claude Code Onboarding Guide.docx
@@ -1019,28 +1019,6 @@
           </w:tcPr>
           <w:p>
             <w:r>
-              <w:t>slack</w:t>
-            </w:r>
-          </w:p>
-        </w:tc>
-        <w:tc>
-          <w:tcPr>
-            <w:tcW w:w="4392" w:type="dxa"/>
-          </w:tcPr>
-          <w:p>
-            <w:r>
-              <w:t>Slack integration: summarize channels, standup generation, draft announcements</w:t>
-            </w:r>
-          </w:p>
-        </w:tc>
-      </w:tr>
-      <w:tr>
-        <w:tc>
-          <w:tcPr>
-            <w:tcW w:w="4392" w:type="dxa"/>
-          </w:tcPr>
-          <w:p>
-            <w:r>
               <w:t>frontend-design</w:t>
             </w:r>
           </w:p>
@@ -1101,6 +1079,143 @@
         </w:tc>
       </w:tr>
     </w:tbl>
+    <w:p/>
+    <w:p>
+      <w:r>
+        <w:t xml:space="preserve">Each plugin serves a distinct purpose. Here is when and why to use each one:</w:t>
+      </w:r>
+    </w:p>
+    <w:p/>
+    <w:p>
+      <w:r>
+        <w:rPr>
+          <w:b/>
+          <w:sz w:val="24"/>
+        </w:rPr>
+        <w:t xml:space="preserve">Superpowers  (superpowers)</w:t>
+      </w:r>
+    </w:p>
+    <w:p>
+      <w:r>
+        <w:t xml:space="preserve">This is the most important plugin — it is what turns Claude from a code-completion tool into an engineering partner. Superpowers provides a suite of workflow skills that enforce disciplined software development:</w:t>
+      </w:r>
+    </w:p>
+    <w:p/>
+    <w:p>
+      <w:r>
+        <w:t xml:space="preserve">•  Brainstorming — Before writing any code, Claude explores your intent, asks clarifying questions, and proposes 2–3 design approaches with tradeoffs. Prevents the #1 AI coding mistake: jumping straight to implementation without understanding the problem.</w:t>
+      </w:r>
+    </w:p>
+    <w:p>
+      <w:r>
+        <w:t xml:space="preserve">•  Writing Plans — Turns a spec into a concrete, step-by-step implementation plan with file paths, test checkpoints, and commit points. Plans are saved to docs/superpowers/plans/ so they survive session restarts.</w:t>
+      </w:r>
+    </w:p>
+    <w:p>
+      <w:r>
+        <w:t xml:space="preserve">•  Executing Plans — Runs a saved plan task-by-task, pausing at review checkpoints. Keeps large features on track without losing context.</w:t>
+      </w:r>
+    </w:p>
+    <w:p>
+      <w:r>
+        <w:t xml:space="preserve">•  Test-Driven Development (TDD) — Forces test-first: write failing test → implement → pass → commit. This is a rigid skill — Claude will not skip steps.</w:t>
+      </w:r>
+    </w:p>
+    <w:p>
+      <w:r>
+        <w:t xml:space="preserve">•  Systematic Debugging — When something breaks, Claude follows a structured diagnosis: reproduce → isolate → root-cause → fix → verify. Prevents shotgun debugging.</w:t>
+      </w:r>
+    </w:p>
+    <w:p>
+      <w:r>
+        <w:t xml:space="preserve">•  Verification Before Completion — Before Claude says “done,” it must run tests and show passing output. No more “I believe this should work” without evidence.</w:t>
+      </w:r>
+    </w:p>
+    <w:p>
+      <w:r>
+        <w:t xml:space="preserve">•  Code Review — Structured review against specs and coding standards. Use after completing a feature branch.</w:t>
+      </w:r>
+    </w:p>
+    <w:p>
+      <w:r>
+        <w:t xml:space="preserve">•  Parallel Agents — Dispatches independent tasks to concurrent subagents. Useful for large refactors or multi-file changes.</w:t>
+      </w:r>
+    </w:p>
+    <w:p>
+      <w:r>
+        <w:t xml:space="preserve">•  Git Worktrees — Creates isolated git worktrees for feature work so your main branch stays clean.</w:t>
+      </w:r>
+    </w:p>
+    <w:p/>
+    <w:p>
+      <w:r>
+        <w:t xml:space="preserve">When to use it: Always. It is enabled by default and activates automatically based on what you are doing. You do not need to invoke it explicitly — just describe what you want to build and the right skills fire.</w:t>
+      </w:r>
+    </w:p>
+    <w:p/>
+    <w:p>
+      <w:r>
+        <w:rPr>
+          <w:b/>
+          <w:sz w:val="24"/>
+        </w:rPr>
+        <w:t xml:space="preserve">Frontend Design  (frontend-design)</w:t>
+      </w:r>
+    </w:p>
+    <w:p>
+      <w:r>
+        <w:t xml:space="preserve">Generates production-grade frontend interfaces with high design quality. The key differentiator: it avoids the generic, cookie-cutter aesthetic that most AI-generated UIs have. Instead, it produces distinctive, polished components that look intentionally designed.</w:t>
+      </w:r>
+    </w:p>
+    <w:p/>
+    <w:p>
+      <w:r>
+        <w:t xml:space="preserve">When to use it: When building React components, pages, or web applications. Say “build a dashboard for X” or “create a settings page” and Claude will use this skill to produce UI code that does not look like it was generated by AI.</w:t>
+      </w:r>
+    </w:p>
+    <w:p/>
+    <w:p>
+      <w:r>
+        <w:rPr>
+          <w:b/>
+          <w:sz w:val="24"/>
+        </w:rPr>
+        <w:t xml:space="preserve">Security Guidance  (security-guidance)</w:t>
+      </w:r>
+    </w:p>
+    <w:p>
+      <w:r>
+        <w:t xml:space="preserve">Embeds security best-practice awareness into every session. Claude will proactively flag potential vulnerabilities (XSS, SQL injection, credential exposure, insecure defaults) as it reads and writes code.</w:t>
+      </w:r>
+    </w:p>
+    <w:p/>
+    <w:p>
+      <w:r>
+        <w:t xml:space="preserve">When to use it: It is always active. You do not invoke it explicitly — it runs in the background and surfaces warnings when relevant. Think of it as a lightweight security reviewer watching every change.</w:t>
+      </w:r>
+    </w:p>
+    <w:p/>
+    <w:p>
+      <w:r>
+        <w:rPr>
+          <w:b/>
+          <w:sz w:val="24"/>
+        </w:rPr>
+        <w:t xml:space="preserve">Ralph Loop  (ralph-loop)</w:t>
+      </w:r>
+    </w:p>
+    <w:p>
+      <w:r>
+        <w:t xml:space="preserve">Runs a background agent loop for recurring tasks and monitoring. You can set Claude to periodically check on something — a build pipeline, a deployment, test results, or any repeating task.</w:t>
+      </w:r>
+    </w:p>
+    <w:p/>
+    <w:p>
+      <w:r>
+        <w:t xml:space="preserve">When to use it: When you need polling or periodic checks. Example: “Check the CI pipeline every 5 minutes and tell me when it passes.” Start with /ralph-loop, cancel with /cancel-ralph.</w:t>
+      </w:r>
+    </w:p>
+    <w:p/>
     <w:p/>
     <w:p>
       <w:pPr>
@@ -1364,6 +1479,88 @@
     </w:tbl>
     <w:p/>
     <w:p>
+      <w:r>
+        <w:t xml:space="preserve">The template includes two custom skills and two slash commands built specifically for ON24 workflows:</w:t>
+      </w:r>
+    </w:p>
+    <w:p/>
+    <w:p>
+      <w:r>
+        <w:rPr>
+          <w:b/>
+          <w:sz w:val="24"/>
+        </w:rPr>
+        <w:t xml:space="preserve">/prd  —  Product Requirements Document</w:t>
+      </w:r>
+    </w:p>
+    <w:p>
+      <w:r>
+        <w:t xml:space="preserve">Trigger: Type /prd in any Claude session.</w:t>
+      </w:r>
+    </w:p>
+    <w:p>
+      <w:r>
+        <w:t xml:space="preserve">What it does: Walks you through a structured PRD creation process — one question at a time — covering problem statement, user personas, goals, non-goals, and testable acceptance criteria. The output is saved to docs/prd/ and becomes the gate for all subsequent design and implementation work.</w:t>
+      </w:r>
+    </w:p>
+    <w:p>
+      <w:r>
+        <w:t xml:space="preserve">Why it matters: Features built without a PRD tend to drift in scope. The PRD skill forces upfront clarity: What problem are we solving? For whom? How will we know it worked? Even a 30-minute task benefits from answering these questions — it takes 2 minutes and prevents 2 hours of rework.</w:t>
+      </w:r>
+    </w:p>
+    <w:p/>
+    <w:p>
+      <w:r>
+        <w:rPr>
+          <w:b/>
+          <w:sz w:val="24"/>
+        </w:rPr>
+        <w:t xml:space="preserve">adr  —  Architecture Decision Records</w:t>
+      </w:r>
+    </w:p>
+    <w:p>
+      <w:r>
+        <w:t xml:space="preserve">Trigger: Say “use the adr skill” or Claude invokes it automatically when it detects a significant technical choice.</w:t>
+      </w:r>
+    </w:p>
+    <w:p>
+      <w:r>
+        <w:t xml:space="preserve">What it does: Enumerates options, evaluates tradeoffs (performance, maintainability, complexity, reversibility), recommends one, and — after your approval — appends a structured record to .ai/decisions.md. Each ADR is under 20 lines.</w:t>
+      </w:r>
+    </w:p>
+    <w:p>
+      <w:r>
+        <w:t>Why it matters: The most expensive sentence in engineering is “I don’t know why we chose that.” ADRs capture not just what was decided but why alternatives were rejected. Six months later, when someone asks “why didn’t we use Redis for the job queue?” the answer is in decisions.md, not in a chat thread nobody can find.</w:t>
+      </w:r>
+    </w:p>
+    <w:p/>
+    <w:p>
+      <w:r>
+        <w:rPr>
+          <w:b/>
+          <w:sz w:val="24"/>
+        </w:rPr>
+        <w:t xml:space="preserve">/rag  —  Query Your Documents</w:t>
+      </w:r>
+    </w:p>
+    <w:p>
+      <w:r>
+        <w:t xml:space="preserve">Trigger: Type /rag &lt;folder&gt; "&lt;question&gt;" in any Claude session.</w:t>
+      </w:r>
+    </w:p>
+    <w:p>
+      <w:r>
+        <w:t xml:space="preserve">What it does: Indexes a folder of documents (Markdown, code, text) and lets you query them using Retrieval-Augmented Generation. Ask natural-language questions against your docs, specs, or any text corpus.</w:t>
+      </w:r>
+    </w:p>
+    <w:p>
+      <w:r>
+        <w:t xml:space="preserve">Why it matters: Large projects accumulate documentation faster than anyone can read. RAG lets you ask “how does authentication work?” against your docs/ folder and get an answer grounded in your actual documentation, not Claude’s training data.</w:t>
+      </w:r>
+    </w:p>
+    <w:p/>
+    <w:p/>
+    <w:p>
       <w:pPr>
         <w:pBdr>
           <w:bottom w:val="single" w:sz="6" w:space="1" w:color="CCCCCC"/>
@@ -1688,31 +1885,6 @@
           <w:sz w:val="18"/>
         </w:rPr>
         <w:t xml:space="preserve"> plugin install superpowers</w:t>
-      </w:r>
-    </w:p>
-    <w:p>
-      <w:pPr>
-        <w:shd w:val="clear" w:color="auto" w:fill="F3F4F6"/>
-        <w:spacing w:before="40" w:after="40"/>
-        <w:ind w:left="576"/>
-      </w:pPr>
-      <w:proofErr w:type="spellStart"/>
-      <w:r>
-        <w:rPr>
-          <w:rFonts w:ascii="Courier New" w:hAnsi="Courier New"/>
-          <w:color w:val="24292F"/>
-          <w:sz w:val="18"/>
-        </w:rPr>
-        <w:t>claude</w:t>
-      </w:r>
-      <w:proofErr w:type="spellEnd"/>
-      <w:r>
-        <w:rPr>
-          <w:rFonts w:ascii="Courier New" w:hAnsi="Courier New"/>
-          <w:color w:val="24292F"/>
-          <w:sz w:val="18"/>
-        </w:rPr>
-        <w:t xml:space="preserve"> plugin install slack</w:t>
       </w:r>
     </w:p>
     <w:p>
@@ -2825,375 +2997,272 @@
       <w:pPr>
         <w:pStyle w:val="Heading2"/>
       </w:pPr>
-      <w:proofErr w:type="gramStart"/>
-      <w:r>
-        <w:rPr>
-          <w:color w:val="1A1A2E"/>
-        </w:rPr>
-        <w:t>5.2  Repo</w:t>
-      </w:r>
-      <w:proofErr w:type="gramEnd"/>
-      <w:r>
-        <w:rPr>
-          <w:color w:val="1A1A2E"/>
-        </w:rPr>
-        <w:t xml:space="preserve"> Memory Pattern</w:t>
-      </w:r>
-    </w:p>
-    <w:p>
-      <w:r>
-        <w:t>Claude's session context is temporary. The .ai/ directory in each repo is permanent. Use it to persist context Claude needs across sessions:</w:t>
-      </w:r>
-    </w:p>
-    <w:p>
-      <w:pPr>
-        <w:ind w:left="432"/>
-      </w:pPr>
-      <w:proofErr w:type="gramStart"/>
-      <w:r>
-        <w:rPr>
-          <w:rFonts w:ascii="Courier New" w:hAnsi="Courier New"/>
+      <w:r>
+        <w:t>5.2  Repo Memory Pattern (.ai/ Directory)</w:t>
+      </w:r>
+    </w:p>
+    <w:p>
+      <w:pPr/>
+    </w:p>
+    <w:p>
+      <w:pPr/>
+      <w:r>
+        <w:rPr>
           <w:b/>
         </w:rPr>
+        <w:t>Why .ai/ — Not Just CLAUDE.md?</w:t>
+      </w:r>
+    </w:p>
+    <w:p>
+      <w:pPr/>
+    </w:p>
+    <w:p>
+      <w:pPr/>
+      <w:r>
+        <w:t>CLAUDE.md tells the agent how to behave — coding conventions, workflow rules, tool permissions. It is prescriptive and stable, changing only when team standards evolve.</w:t>
+      </w:r>
+    </w:p>
+    <w:p>
+      <w:pPr/>
+    </w:p>
+    <w:p>
+      <w:pPr/>
+      <w:r>
+        <w:t>The .ai/ directory captures living project state — what this repo does, how it is built, what decisions were made, what is in progress right now. This is descriptive and changes constantly.</w:t>
+      </w:r>
+    </w:p>
+    <w:p>
+      <w:pPr/>
+    </w:p>
+    <w:p>
+      <w:pPr/>
+      <w:r>
+        <w:t>Mixing both into CLAUDE.md creates problems:</w:t>
+      </w:r>
+    </w:p>
+    <w:p>
+      <w:pPr>
+        <w:pStyle w:val="ListBullet"/>
+      </w:pPr>
+      <w:r>
+        <w:t>Bloat — Volatile state (tasks, decision logs) mixed into stable instructions makes the file unwieldy. Engineers stop maintaining it.</w:t>
+      </w:r>
+    </w:p>
+    <w:p>
+      <w:pPr>
+        <w:pStyle w:val="ListBullet"/>
+      </w:pPr>
+      <w:r>
+        <w:t>No automation — CLAUDE.md updates are manual. .ai/ files are populated and kept current by hooks automatically, with zero human effort.</w:t>
+      </w:r>
+    </w:p>
+    <w:p>
+      <w:pPr>
+        <w:pStyle w:val="ListBullet"/>
+      </w:pPr>
+      <w:r>
+        <w:t>Cross-project discovery — .ai/ files use a consistent structure across every repo. This makes them queryable via MCP. You can ask “do we have a service that handles authentication?” across 20 repos because every repo has an architecture.md in the same format — not buried in a CLAUDE.md that each team structures differently.</w:t>
+      </w:r>
+    </w:p>
+    <w:p>
+      <w:pPr/>
+    </w:p>
+    <w:p>
+      <w:pPr/>
+      <w:r>
+        <w:t>In short: CLAUDE.md = instructions to the agent. .ai/ = knowledge about the project. Separate concerns, separately maintained.</w:t>
+      </w:r>
+    </w:p>
+    <w:p>
+      <w:pPr/>
+    </w:p>
+    <w:p>
+      <w:pPr/>
+      <w:r>
+        <w:rPr>
+          <w:b/>
+        </w:rPr>
+        <w:t>.ai/ File Reference</w:t>
+      </w:r>
+    </w:p>
+    <w:p>
+      <w:pPr/>
+    </w:p>
+    <w:p>
+      <w:pPr/>
+      <w:r>
+        <w:t>Every project gets a .ai/ directory containing these files:</w:t>
+      </w:r>
+    </w:p>
+    <w:p>
+      <w:pPr/>
+    </w:p>
+    <w:p>
+      <w:pPr/>
+      <w:r>
+        <w:rPr>
+          <w:b/>
+        </w:rPr>
         <w:t>.ai/project.md</w:t>
       </w:r>
-      <w:proofErr w:type="gramEnd"/>
-      <w:r>
-        <w:rPr>
-          <w:rFonts w:ascii="Courier New" w:hAnsi="Courier New"/>
+    </w:p>
+    <w:p>
+      <w:pPr/>
+      <w:r>
+        <w:t>Purpose: What this repo does, who uses it, key constraints and non-obvious context.</w:t>
+      </w:r>
+    </w:p>
+    <w:p>
+      <w:pPr/>
+      <w:r>
+        <w:t>Kept up to date: Auto-populated on first session by reading package.json, README, pyproject.toml, go.mod, and key source directories. Updated manually or by Claude when the project scope changes.</w:t>
+      </w:r>
+    </w:p>
+    <w:p>
+      <w:pPr/>
+    </w:p>
+    <w:p>
+      <w:pPr/>
+      <w:r>
+        <w:rPr>
           <w:b/>
         </w:rPr>
-        <w:t xml:space="preserve">  </w:t>
-      </w:r>
-      <w:proofErr w:type="gramStart"/>
-      <w:r>
-        <w:rPr>
-          <w:rFonts w:ascii="Courier New" w:hAnsi="Courier New"/>
+        <w:t>.ai/architecture.md</w:t>
+      </w:r>
+    </w:p>
+    <w:p>
+      <w:pPr/>
+      <w:r>
+        <w:t>Purpose: System design, key modules and packages, data flow, external dependencies and integrations.</w:t>
+      </w:r>
+    </w:p>
+    <w:p>
+      <w:pPr/>
+      <w:r>
+        <w:t>Kept up to date: Auto-populated on first session by scanning the codebase structure. Updated manually or by Claude when architecture evolves (new services, changed data flow, added integrations).</w:t>
+      </w:r>
+    </w:p>
+    <w:p>
+      <w:pPr/>
+    </w:p>
+    <w:p>
+      <w:pPr/>
+      <w:r>
+        <w:rPr>
           <w:b/>
         </w:rPr>
-        <w:t>—  What</w:t>
-      </w:r>
-      <w:proofErr w:type="gramEnd"/>
-      <w:r>
-        <w:rPr>
-          <w:rFonts w:ascii="Courier New" w:hAnsi="Courier New"/>
+        <w:t>.ai/commands.md</w:t>
+      </w:r>
+    </w:p>
+    <w:p>
+      <w:pPr/>
+      <w:r>
+        <w:t>Purpose: How to install, run (dev), test, build, and deploy — exact copy-pasteable commands.</w:t>
+      </w:r>
+    </w:p>
+    <w:p>
+      <w:pPr/>
+      <w:r>
+        <w:t>Kept up to date: Auto-populated on first session from package.json scripts, Makefiles, Dockerfiles, CI configs, etc. Updated when build/deploy steps change.</w:t>
+      </w:r>
+    </w:p>
+    <w:p>
+      <w:pPr/>
+    </w:p>
+    <w:p>
+      <w:pPr/>
+      <w:r>
+        <w:rPr>
           <w:b/>
         </w:rPr>
-        <w:t xml:space="preserve"> this repo does, who uses it, key </w:t>
-      </w:r>
-      <w:proofErr w:type="gramStart"/>
-      <w:r>
-        <w:rPr>
-          <w:rFonts w:ascii="Courier New" w:hAnsi="Courier New"/>
+        <w:t>.ai/tasks.md</w:t>
+      </w:r>
+    </w:p>
+    <w:p>
+      <w:pPr/>
+      <w:r>
+        <w:t>Purpose: Current priorities, in-flight work, and blocked items.</w:t>
+      </w:r>
+    </w:p>
+    <w:p>
+      <w:pPr/>
+      <w:r>
+        <w:t>Kept up to date: Auto-updated every 20 minutes by a scheduled cron job (set up automatically by the SessionStart hook). Captures what has been accomplished, what is in progress, and what is next. Requires no manual maintenance.</w:t>
+      </w:r>
+    </w:p>
+    <w:p>
+      <w:pPr/>
+    </w:p>
+    <w:p>
+      <w:pPr/>
+      <w:r>
+        <w:rPr>
           <w:b/>
         </w:rPr>
-        <w:t>constraints  [</w:t>
-      </w:r>
-      <w:proofErr w:type="gramEnd"/>
-      <w:r>
-        <w:rPr>
-          <w:rFonts w:ascii="Courier New" w:hAnsi="Courier New"/>
+        <w:t>.ai/decisions.md</w:t>
+      </w:r>
+    </w:p>
+    <w:p>
+      <w:pPr/>
+      <w:r>
+        <w:t>Purpose: Architecture Decision Record (ADR) log. Each entry captures: date, decision title, context, options considered, chosen option, and consequences.</w:t>
+      </w:r>
+    </w:p>
+    <w:p>
+      <w:pPr/>
+      <w:r>
+        <w:t>Kept up to date: Maintained via the adr skill. When facing a technical decision, say “use the adr skill” and Claude will guide you through structured evaluation and append the result. Never edited by automation — always a deliberate human+AI act.</w:t>
+      </w:r>
+    </w:p>
+    <w:p>
+      <w:pPr/>
+    </w:p>
+    <w:p>
+      <w:pPr/>
+      <w:r>
+        <w:rPr>
           <w:b/>
         </w:rPr>
-        <w:t>auto-</w:t>
-      </w:r>
-      <w:proofErr w:type="gramStart"/>
-      <w:r>
-        <w:rPr>
-          <w:rFonts w:ascii="Courier New" w:hAnsi="Courier New"/>
-          <w:b/>
-        </w:rPr>
-        <w:t xml:space="preserve">populated]  </w:t>
-      </w:r>
-      <w:r>
-        <w:t>What</w:t>
-      </w:r>
-      <w:proofErr w:type="gramEnd"/>
-      <w:r>
-        <w:t xml:space="preserve"> this repo does, who uses it, key constraints</w:t>
-      </w:r>
-    </w:p>
-    <w:p>
-      <w:pPr>
-        <w:ind w:left="432"/>
-      </w:pPr>
-      <w:proofErr w:type="gramStart"/>
-      <w:r>
-        <w:rPr>
-          <w:rFonts w:ascii="Courier New" w:hAnsi="Courier New"/>
-          <w:b/>
-        </w:rPr>
-        <w:t>.ai/architecture.md</w:t>
-      </w:r>
-      <w:proofErr w:type="gramEnd"/>
-      <w:r>
-        <w:rPr>
-          <w:rFonts w:ascii="Courier New" w:hAnsi="Courier New"/>
-          <w:b/>
-        </w:rPr>
-        <w:t xml:space="preserve">  </w:t>
-      </w:r>
-      <w:proofErr w:type="gramStart"/>
-      <w:r>
-        <w:rPr>
-          <w:rFonts w:ascii="Courier New" w:hAnsi="Courier New"/>
-          <w:b/>
-        </w:rPr>
-        <w:t>—  System</w:t>
-      </w:r>
-      <w:proofErr w:type="gramEnd"/>
-      <w:r>
-        <w:rPr>
-          <w:rFonts w:ascii="Courier New" w:hAnsi="Courier New"/>
-          <w:b/>
-        </w:rPr>
-        <w:t xml:space="preserve"> design, modules, data </w:t>
-      </w:r>
-      <w:proofErr w:type="gramStart"/>
-      <w:r>
-        <w:rPr>
-          <w:rFonts w:ascii="Courier New" w:hAnsi="Courier New"/>
-          <w:b/>
-        </w:rPr>
-        <w:t>flow  [</w:t>
-      </w:r>
-      <w:proofErr w:type="gramEnd"/>
-      <w:r>
-        <w:rPr>
-          <w:rFonts w:ascii="Courier New" w:hAnsi="Courier New"/>
-          <w:b/>
-        </w:rPr>
-        <w:t>auto-</w:t>
-      </w:r>
-      <w:proofErr w:type="gramStart"/>
-      <w:r>
-        <w:rPr>
-          <w:rFonts w:ascii="Courier New" w:hAnsi="Courier New"/>
-          <w:b/>
-        </w:rPr>
-        <w:t xml:space="preserve">populated]  </w:t>
-      </w:r>
-      <w:r>
-        <w:t>System</w:t>
-      </w:r>
-      <w:proofErr w:type="gramEnd"/>
-      <w:r>
-        <w:t xml:space="preserve"> design, modules, data flow</w:t>
-      </w:r>
-    </w:p>
-    <w:p>
-      <w:pPr>
-        <w:ind w:left="432"/>
-      </w:pPr>
-      <w:proofErr w:type="gramStart"/>
-      <w:r>
-        <w:rPr>
-          <w:rFonts w:ascii="Courier New" w:hAnsi="Courier New"/>
-          <w:b/>
-        </w:rPr>
-        <w:t>.ai/commands.md</w:t>
-      </w:r>
-      <w:proofErr w:type="gramEnd"/>
-      <w:r>
-        <w:rPr>
-          <w:rFonts w:ascii="Courier New" w:hAnsi="Courier New"/>
-          <w:b/>
-        </w:rPr>
-        <w:t xml:space="preserve">  </w:t>
-      </w:r>
-      <w:proofErr w:type="gramStart"/>
-      <w:r>
-        <w:rPr>
-          <w:rFonts w:ascii="Courier New" w:hAnsi="Courier New"/>
-          <w:b/>
-        </w:rPr>
-        <w:t>—  How</w:t>
-      </w:r>
-      <w:proofErr w:type="gramEnd"/>
-      <w:r>
-        <w:rPr>
-          <w:rFonts w:ascii="Courier New" w:hAnsi="Courier New"/>
-          <w:b/>
-        </w:rPr>
-        <w:t xml:space="preserve"> to run, test, deploy — exact </w:t>
-      </w:r>
-      <w:proofErr w:type="gramStart"/>
-      <w:r>
-        <w:rPr>
-          <w:rFonts w:ascii="Courier New" w:hAnsi="Courier New"/>
-          <w:b/>
-        </w:rPr>
-        <w:t>commands  [</w:t>
-      </w:r>
-      <w:proofErr w:type="gramEnd"/>
-      <w:r>
-        <w:rPr>
-          <w:rFonts w:ascii="Courier New" w:hAnsi="Courier New"/>
-          <w:b/>
-        </w:rPr>
-        <w:t>auto-</w:t>
-      </w:r>
-      <w:proofErr w:type="gramStart"/>
-      <w:r>
-        <w:rPr>
-          <w:rFonts w:ascii="Courier New" w:hAnsi="Courier New"/>
-          <w:b/>
-        </w:rPr>
-        <w:t xml:space="preserve">populated]  </w:t>
-      </w:r>
-      <w:r>
-        <w:t>How</w:t>
-      </w:r>
-      <w:proofErr w:type="gramEnd"/>
-      <w:r>
-        <w:t xml:space="preserve"> to run, test, deploy — exact commands</w:t>
-      </w:r>
-    </w:p>
-    <w:p>
-      <w:pPr>
-        <w:ind w:left="432"/>
-      </w:pPr>
-      <w:proofErr w:type="gramStart"/>
-      <w:r>
-        <w:rPr>
-          <w:rFonts w:ascii="Courier New" w:hAnsi="Courier New"/>
-          <w:b/>
-        </w:rPr>
-        <w:lastRenderedPageBreak/>
-        <w:t>.ai/tasks.md</w:t>
-      </w:r>
-      <w:proofErr w:type="gramEnd"/>
-      <w:r>
-        <w:rPr>
-          <w:rFonts w:ascii="Courier New" w:hAnsi="Courier New"/>
-          <w:b/>
-        </w:rPr>
-        <w:t xml:space="preserve">  </w:t>
-      </w:r>
-      <w:proofErr w:type="gramStart"/>
-      <w:r>
-        <w:rPr>
-          <w:rFonts w:ascii="Courier New" w:hAnsi="Courier New"/>
-          <w:b/>
-        </w:rPr>
-        <w:t>—  Current</w:t>
-      </w:r>
-      <w:proofErr w:type="gramEnd"/>
-      <w:r>
-        <w:rPr>
-          <w:rFonts w:ascii="Courier New" w:hAnsi="Courier New"/>
-          <w:b/>
-        </w:rPr>
-        <w:t xml:space="preserve"> sprint priorities and in-flight </w:t>
-      </w:r>
-      <w:proofErr w:type="gramStart"/>
-      <w:r>
-        <w:rPr>
-          <w:rFonts w:ascii="Courier New" w:hAnsi="Courier New"/>
-          <w:b/>
-        </w:rPr>
-        <w:t>work  [</w:t>
-      </w:r>
-      <w:proofErr w:type="gramEnd"/>
-      <w:r>
-        <w:rPr>
-          <w:rFonts w:ascii="Courier New" w:hAnsi="Courier New"/>
-          <w:b/>
-        </w:rPr>
-        <w:t xml:space="preserve">auto-updated every 20 </w:t>
-      </w:r>
-      <w:proofErr w:type="gramStart"/>
-      <w:r>
-        <w:rPr>
-          <w:rFonts w:ascii="Courier New" w:hAnsi="Courier New"/>
-          <w:b/>
-        </w:rPr>
-        <w:t xml:space="preserve">min]  </w:t>
-      </w:r>
-      <w:r>
-        <w:t>Current</w:t>
-      </w:r>
-      <w:proofErr w:type="gramEnd"/>
-      <w:r>
-        <w:t xml:space="preserve"> sprint priorities and in-flight work</w:t>
-      </w:r>
-    </w:p>
-    <w:p>
-      <w:pPr>
-        <w:ind w:left="432"/>
-        <w:shd w:val="clear" w:color="auto" w:fill="EBF3FB"/>
-      </w:pPr>
-      <w:r>
-        <w:rPr>
-          <w:b/>
-          <w:color w:val="0047AB"/>
-        </w:rPr>
-        <w:t xml:space="preserve">COPY TO GET STARTED FAST  </w:t>
-      </w:r>
-      <w:r>
-        <w:t>The template ships with example-ai/ — six annotated files showing the expected format and depth. Copy to any repo as .ai/ and either fill manually or ask Claude: "Read the codebase and fill in .ai/project.md, .ai/architecture.md, and .ai/commands.md"</w:t>
-      </w:r>
-    </w:p>
-    <w:p>
-      <w:pPr>
-        <w:ind w:left="432"/>
-      </w:pPr>
-      <w:proofErr w:type="gramStart"/>
-      <w:r>
-        <w:rPr>
-          <w:rFonts w:ascii="Courier New" w:hAnsi="Courier New"/>
-          <w:b/>
-        </w:rPr>
-        <w:t>.ai/decisions.md</w:t>
-      </w:r>
-      <w:proofErr w:type="gramEnd"/>
-      <w:r>
-        <w:rPr>
-          <w:rFonts w:ascii="Courier New" w:hAnsi="Courier New"/>
-          <w:b/>
-        </w:rPr>
-        <w:t xml:space="preserve">  </w:t>
-      </w:r>
-      <w:r>
-        <w:t xml:space="preserve">ADR log — use the </w:t>
-      </w:r>
-      <w:proofErr w:type="spellStart"/>
-      <w:r>
-        <w:t>adr</w:t>
-      </w:r>
-      <w:proofErr w:type="spellEnd"/>
-      <w:r>
-        <w:t xml:space="preserve"> skill to append entries</w:t>
-      </w:r>
-    </w:p>
-    <w:p/>
-    <w:p>
-      <w:proofErr w:type="gramStart"/>
-      <w:r>
-        <w:t>.ai/project.md</w:t>
-      </w:r>
-      <w:proofErr w:type="gramEnd"/>
-      <w:r>
-        <w:t xml:space="preserve">  </w:t>
-      </w:r>
-      <w:proofErr w:type="gramStart"/>
-      <w:r>
-        <w:t>—  What</w:t>
-      </w:r>
-      <w:proofErr w:type="gramEnd"/>
-      <w:r>
-        <w:t xml:space="preserve"> this repo does, who uses it, key </w:t>
-      </w:r>
-      <w:proofErr w:type="gramStart"/>
-      <w:r>
-        <w:t>constraints  [</w:t>
-      </w:r>
-      <w:proofErr w:type="gramEnd"/>
-      <w:r>
-        <w:t>auto-populated]</w:t>
-      </w:r>
-    </w:p>
-    <w:p/>
+        <w:t>How Auto-Population Works</w:t>
+      </w:r>
+    </w:p>
+    <w:p>
+      <w:pPr/>
+    </w:p>
+    <w:p>
+      <w:pPr/>
+      <w:r>
+        <w:t>The SessionStart hook (hooks-handlers/init-ai.sh) runs every time Claude opens in a git repo:</w:t>
+      </w:r>
+    </w:p>
+    <w:p>
+      <w:pPr>
+        <w:pStyle w:val="ListNumber"/>
+      </w:pPr>
+      <w:r>
+        <w:t>First session in a repo: The hook creates .ai/ with scaffold templates, then instructs Claude to read the codebase and populate project.md, architecture.md, and commands.md with real content. This happens silently before your first message.</w:t>
+      </w:r>
+    </w:p>
+    <w:p>
+      <w:pPr>
+        <w:pStyle w:val="ListNumber"/>
+      </w:pPr>
+      <w:r>
+        <w:t>Every session: The hook schedules a cron job (every 20 minutes) that updates tasks.md with session progress. This runs in the background — you never see it.</w:t>
+      </w:r>
+    </w:p>
+    <w:p>
+      <w:pPr/>
+    </w:p>
+    <w:p>
+      <w:pPr/>
+      <w:r>
+        <w:t>The result: .ai/ files are always current without any manual effort. Engineers can switch repos or pick up after days away and Claude has full context immediately.</w:t>
+      </w:r>
+    </w:p>
+    <w:p>
+      <w:pPr/>
+    </w:p>
     <w:p>
       <w:pPr>
         <w:pStyle w:val="Heading2"/>
@@ -4785,6 +4854,114 @@
         <w:t xml:space="preserve">  2026</w:t>
       </w:r>
     </w:p>
+    <w:p/>
+    <w:p>
+      <w:pPr>
+        <w:pStyle w:val="Heading1"/>
+      </w:pPr>
+      <w:r>
+        <w:t>Appendix A — Frequently Asked Questions</w:t>
+      </w:r>
+    </w:p>
+    <w:p/>
+    <w:p>
+      <w:r>
+        <w:rPr>
+          <w:b/>
+        </w:rPr>
+        <w:t>Q: Why not just put everything in CLAUDE.md?</w:t>
+      </w:r>
+    </w:p>
+    <w:p>
+      <w:r>
+        <w:t>A: CLAUDE.md is for agent instructions — how to behave, what conventions to follow. .ai/ is for project knowledge — architecture, tasks, decisions. Keeping them separate means instructions stay stable while project state updates automatically via hooks. It also enables cross-project MCP queries: because every repo uses the same .ai/ structure, you can ask “which services handle X?” across your entire system and get structured answers.</w:t>
+      </w:r>
+    </w:p>
+    <w:p/>
+    <w:p>
+      <w:r>
+        <w:rPr>
+          <w:b/>
+        </w:rPr>
+        <w:t>Q: Won’t .ai/ files go stale?</w:t>
+      </w:r>
+    </w:p>
+    <w:p>
+      <w:r>
+        <w:t>A: No. The SessionStart hook auto-populates them on first use, and a 20-minute cron job keeps tasks.md current throughout every session. architecture.md and commands.md are updated by Claude whenever it makes changes that affect them. decisions.md is append-only via the adr skill. The only file that could drift is project.md, and only if the project’s mission fundamentally changes — which is rare.</w:t>
+      </w:r>
+    </w:p>
+    <w:p/>
+    <w:p>
+      <w:r>
+        <w:rPr>
+          <w:b/>
+        </w:rPr>
+        <w:t>Q: Should .ai/ files be committed to the repo?</w:t>
+      </w:r>
+    </w:p>
+    <w:p>
+      <w:r>
+        <w:t>A: Yes. They are part of the project’s durable memory. Any team member — or agent — opening the repo gets immediate context without re-discovering everything. Treat them like you would treat a README: checked in, reviewed in PRs, kept accurate.</w:t>
+      </w:r>
+    </w:p>
+    <w:p/>
+    <w:p>
+      <w:r>
+        <w:rPr>
+          <w:b/>
+        </w:rPr>
+        <w:t>Q: Can I query .ai/ files across repos?</w:t>
+      </w:r>
+    </w:p>
+    <w:p>
+      <w:r>
+        <w:t>A: Yes — that is a key benefit. Because every repo uses the same .ai/ structure, you can expose them via MCP and ask questions like “which services handle authentication?” or “do we have a job queue?” across your entire system. The consistent file format makes this possible without custom parsing.</w:t>
+      </w:r>
+    </w:p>
+    <w:p/>
+    <w:p>
+      <w:r>
+        <w:rPr>
+          <w:b/>
+        </w:rPr>
+        <w:t>Q: What if I already have comprehensive CLAUDE.md files that include project context?</w:t>
+      </w:r>
+    </w:p>
+    <w:p>
+      <w:r>
+        <w:t>A: That works, but it does not scale. As the project context grows, CLAUDE.md becomes harder to maintain manually, harder to parse for cross-project queries, and mixes volatile information (current tasks) with stable instructions (coding standards). The .ai/ pattern separates these concerns and automates the volatile parts.</w:t>
+      </w:r>
+    </w:p>
+    <w:p/>
+    <w:p>
+      <w:r>
+        <w:rPr>
+          <w:b/>
+        </w:rPr>
+        <w:t>Q: Does the .ai/ directory work with other AI coding tools (Cursor, Copilot, etc.)?</w:t>
+      </w:r>
+    </w:p>
+    <w:p>
+      <w:r>
+        <w:t>A: The files are plain Markdown, so any tool that reads project files can benefit from them. The auto-population and cron sync are Claude Code-specific features, but the directory itself is tool-agnostic knowledge.</w:t>
+      </w:r>
+    </w:p>
+    <w:p/>
+    <w:p>
+      <w:r>
+        <w:rPr>
+          <w:b/>
+        </w:rPr>
+        <w:t>Q: How much token budget do .ai/ files consume?</w:t>
+      </w:r>
+    </w:p>
+    <w:p>
+      <w:r>
+        <w:t>A: Minimal. The five files together are typically under 2,000 tokens — less than a single source file. Claude reads them at session start, and the context payoff (no re-exploration, no repeated questions) far exceeds the token cost.</w:t>
+      </w:r>
+    </w:p>
+    <w:p/>
     <w:sectPr>
       <w:pgSz w:w="12240" w:h="15840"/>
       <w:pgMar w:top="1440" w:right="1728" w:bottom="1440" w:left="1728" w:header="720" w:footer="720" w:gutter="0"/>

</xml_diff>

<commit_message>
Add html-docs skill to template and onboarding doc
- Copied html-docs skill into plugins/local/user-skills/skills/
- Added evangelism section and table row in Word doc
- Updated README with html-docs in skills table

Co-Authored-By: Claude Opus 4.6 (1M context) <noreply@anthropic.com>
</commit_message>
<xml_diff>
--- a/ON24 Claude Code Onboarding Guide.docx
+++ b/ON24 Claude Code Onboarding Guide.docx
@@ -1476,6 +1476,38 @@
           <w:p/>
         </w:tc>
       </w:tr>
+      <w:tr>
+        <w:tc>
+          <w:tcPr>
+            <w:tcW w:type="dxa" w:w="2928"/>
+          </w:tcPr>
+          <w:p>
+            <w:r>
+              <w:t>html-docs</w:t>
+            </w:r>
+          </w:p>
+        </w:tc>
+        <w:tc>
+          <w:tcPr>
+            <w:tcW w:type="dxa" w:w="2928"/>
+          </w:tcPr>
+          <w:p>
+            <w:r>
+              <w:t>automatic / on request</w:t>
+            </w:r>
+          </w:p>
+        </w:tc>
+        <w:tc>
+          <w:tcPr>
+            <w:tcW w:type="dxa" w:w="2928"/>
+          </w:tcPr>
+          <w:p>
+            <w:r>
+              <w:t>Generates themed HTML docs (test plans, security reviews, architecture) with auto-discovery, dashboards, and dark mode</w:t>
+            </w:r>
+          </w:p>
+        </w:tc>
+      </w:tr>
     </w:tbl>
     <w:p/>
     <w:p>
@@ -1556,6 +1588,31 @@
     <w:p>
       <w:r>
         <w:t xml:space="preserve">Why it matters: Large projects accumulate documentation faster than anyone can read. RAG lets you ask “how does authentication work?” against your docs/ folder and get an answer grounded in your actual documentation, not Claude’s training data.</w:t>
+      </w:r>
+    </w:p>
+    <w:p/>
+    <w:p>
+      <w:r>
+        <w:rPr>
+          <w:b/>
+          <w:sz w:val="24"/>
+        </w:rPr>
+        <w:t xml:space="preserve">html-docs  —  Professional HTML Documentation Generator</w:t>
+      </w:r>
+    </w:p>
+    <w:p>
+      <w:r>
+        <w:t xml:space="preserve">Trigger: Say “use the html-docs skill” or “generate a test plan / security review / architecture doc.”</w:t>
+      </w:r>
+    </w:p>
+    <w:p>
+      <w:r>
+        <w:t xml:space="preserve">What it does: Auto-discovers your codebase (runs tests, scans for security patterns, reads Docker/CI configs) and generates beautiful, self-contained HTML documents with dashboards, charts, tables, and dark mode support. Supports test plans, security reviews, scalability assessments, architecture overviews, and recent-changes summaries. Includes a floating doc-nav widget that links all your generated docs together.</w:t>
+      </w:r>
+    </w:p>
+    <w:p>
+      <w:r>
+        <w:t xml:space="preserve">Why it matters: Documentation that nobody reads is documentation that does not exist. html-docs produces polished, themed HTML that people actually want to open — not a wall of Markdown in a repo nobody browses. The auto-discovery means docs stay current with real data (actual test counts, actual security findings) instead of rotting. Schedule regeneration on a cron and your docs are always fresh.</w:t>
       </w:r>
     </w:p>
     <w:p/>

</xml_diff>

<commit_message>
Refresh file structure in onboarding doc and README
- Updated file tree to reflect current template contents
- Added projects/template/memory/, example-ai/, html-docs skill
- Added /rag to README skills table
- Fixed tree nesting (plugins/, hooks-handlers/ properly nested)

Co-Authored-By: Claude Opus 4.6 (1M context) <noreply@anthropic.com>
</commit_message>
<xml_diff>
--- a/ON24 Claude Code Onboarding Guide.docx
+++ b/ON24 Claude Code Onboarding Guide.docx
@@ -452,491 +452,119 @@
       </w:r>
     </w:p>
     <w:p>
-      <w:pPr>
-        <w:shd w:val="clear" w:color="auto" w:fill="F3F4F6"/>
-        <w:spacing w:before="40" w:after="40"/>
-        <w:ind w:left="576"/>
-      </w:pPr>
-      <w:proofErr w:type="gramStart"/>
-      <w:r>
-        <w:rPr>
-          <w:rFonts w:ascii="Courier New" w:hAnsi="Courier New"/>
-          <w:color w:val="24292F"/>
-          <w:sz w:val="18"/>
-        </w:rPr>
-        <w:t>.</w:t>
-      </w:r>
-      <w:proofErr w:type="spellStart"/>
-      <w:r>
-        <w:rPr>
-          <w:rFonts w:ascii="Courier New" w:hAnsi="Courier New"/>
-          <w:color w:val="24292F"/>
-          <w:sz w:val="18"/>
-        </w:rPr>
-        <w:t>claude</w:t>
-      </w:r>
-      <w:proofErr w:type="spellEnd"/>
-      <w:proofErr w:type="gramEnd"/>
-      <w:r>
-        <w:rPr>
-          <w:rFonts w:ascii="Courier New" w:hAnsi="Courier New"/>
-          <w:color w:val="24292F"/>
-          <w:sz w:val="18"/>
-        </w:rPr>
-        <w:t>/</w:t>
-      </w:r>
-    </w:p>
-    <w:p>
-      <w:pPr>
-        <w:shd w:val="clear" w:color="auto" w:fill="F3F4F6"/>
-        <w:spacing w:before="40" w:after="40"/>
-        <w:ind w:left="576"/>
-      </w:pPr>
-      <w:r>
-        <w:rPr>
-          <w:rFonts w:ascii="Courier New" w:hAnsi="Courier New"/>
-          <w:color w:val="24292F"/>
-          <w:sz w:val="18"/>
-        </w:rPr>
-        <w:t>├── CLAUDE.md                   ← Global instructions (loaded every session)</w:t>
-      </w:r>
-    </w:p>
-    <w:p>
-      <w:pPr>
-        <w:shd w:val="clear" w:color="auto" w:fill="F3F4F6"/>
-        <w:spacing w:before="40" w:after="40"/>
-        <w:ind w:left="576"/>
-      </w:pPr>
-      <w:r>
-        <w:rPr>
-          <w:rFonts w:ascii="Courier New" w:hAnsi="Courier New"/>
-          <w:color w:val="24292F"/>
-          <w:sz w:val="18"/>
-        </w:rPr>
-        <w:t xml:space="preserve">├── </w:t>
-      </w:r>
-      <w:proofErr w:type="spellStart"/>
-      <w:proofErr w:type="gramStart"/>
-      <w:r>
-        <w:rPr>
-          <w:rFonts w:ascii="Courier New" w:hAnsi="Courier New"/>
-          <w:color w:val="24292F"/>
-          <w:sz w:val="18"/>
-        </w:rPr>
-        <w:t>settings.json</w:t>
-      </w:r>
-      <w:proofErr w:type="spellEnd"/>
-      <w:proofErr w:type="gramEnd"/>
-      <w:r>
-        <w:rPr>
-          <w:rFonts w:ascii="Courier New" w:hAnsi="Courier New"/>
-          <w:color w:val="24292F"/>
-          <w:sz w:val="18"/>
-        </w:rPr>
-        <w:t xml:space="preserve">               ← Permissions, plugins, output style</w:t>
-      </w:r>
-    </w:p>
-    <w:p>
-      <w:pPr>
-        <w:shd w:val="clear" w:color="auto" w:fill="F3F4F6"/>
-        <w:spacing w:before="40" w:after="40"/>
-        <w:ind w:left="576"/>
-      </w:pPr>
-      <w:r>
-        <w:rPr>
-          <w:rFonts w:ascii="Courier New" w:hAnsi="Courier New"/>
-          <w:color w:val="24292F"/>
-          <w:sz w:val="18"/>
-        </w:rPr>
-        <w:t>├── policy-</w:t>
-      </w:r>
-      <w:proofErr w:type="spellStart"/>
-      <w:proofErr w:type="gramStart"/>
-      <w:r>
-        <w:rPr>
-          <w:rFonts w:ascii="Courier New" w:hAnsi="Courier New"/>
-          <w:color w:val="24292F"/>
-          <w:sz w:val="18"/>
-        </w:rPr>
-        <w:t>limits.json</w:t>
-      </w:r>
-      <w:proofErr w:type="spellEnd"/>
-      <w:proofErr w:type="gramEnd"/>
-      <w:r>
-        <w:rPr>
-          <w:rFonts w:ascii="Courier New" w:hAnsi="Courier New"/>
-          <w:color w:val="24292F"/>
-          <w:sz w:val="18"/>
-        </w:rPr>
-        <w:t xml:space="preserve">          ← </w:t>
-      </w:r>
-      <w:proofErr w:type="gramStart"/>
-      <w:r>
-        <w:rPr>
-          <w:rFonts w:ascii="Courier New" w:hAnsi="Courier New"/>
-          <w:color w:val="24292F"/>
-          <w:sz w:val="18"/>
-        </w:rPr>
-        <w:t>Security:</w:t>
-      </w:r>
-      <w:proofErr w:type="gramEnd"/>
-      <w:r>
-        <w:rPr>
-          <w:rFonts w:ascii="Courier New" w:hAnsi="Courier New"/>
-          <w:color w:val="24292F"/>
-          <w:sz w:val="18"/>
-        </w:rPr>
-        <w:t xml:space="preserve"> disables remote control</w:t>
-      </w:r>
-    </w:p>
-    <w:p>
-      <w:pPr>
-        <w:shd w:val="clear" w:color="auto" w:fill="F3F4F6"/>
-        <w:spacing w:before="40" w:after="40"/>
-        <w:ind w:left="576"/>
-      </w:pPr>
-      <w:r>
-        <w:rPr>
-          <w:rFonts w:ascii="Courier New" w:hAnsi="Courier New"/>
-          <w:color w:val="24292F"/>
-          <w:sz w:val="18"/>
-        </w:rPr>
-        <w:t>├─</w:t>
-      </w:r>
-      <w:proofErr w:type="gramStart"/>
-      <w:r>
-        <w:rPr>
-          <w:rFonts w:ascii="Courier New" w:hAnsi="Courier New"/>
-          <w:color w:val="24292F"/>
-          <w:sz w:val="18"/>
-        </w:rPr>
-        <w:t>─ .</w:t>
-      </w:r>
-      <w:proofErr w:type="spellStart"/>
-      <w:r>
-        <w:rPr>
-          <w:rFonts w:ascii="Courier New" w:hAnsi="Courier New"/>
-          <w:color w:val="24292F"/>
-          <w:sz w:val="18"/>
-        </w:rPr>
-        <w:t>gitignore</w:t>
-      </w:r>
-      <w:proofErr w:type="spellEnd"/>
-      <w:proofErr w:type="gramEnd"/>
-      <w:r>
-        <w:rPr>
-          <w:rFonts w:ascii="Courier New" w:hAnsi="Courier New"/>
-          <w:color w:val="24292F"/>
-          <w:sz w:val="18"/>
-        </w:rPr>
-        <w:t xml:space="preserve">                  ← Excludes ephemeral files from git</w:t>
-      </w:r>
-    </w:p>
-    <w:p>
-      <w:pPr>
-        <w:shd w:val="clear" w:color="auto" w:fill="F3F4F6"/>
-        <w:spacing w:before="40" w:after="40"/>
-        <w:ind w:left="576"/>
-      </w:pPr>
-      <w:r>
-        <w:rPr>
-          <w:rFonts w:ascii="Courier New" w:hAnsi="Courier New"/>
-          <w:color w:val="24292F"/>
-          <w:sz w:val="18"/>
-        </w:rPr>
-        <w:t>├── README.md                   ← Quick reference</w:t>
-      </w:r>
-    </w:p>
-    <w:p>
-      <w:pPr>
-        <w:shd w:val="clear" w:color="auto" w:fill="F3F4F6"/>
-        <w:spacing w:before="40" w:after="40"/>
-        <w:ind w:left="576"/>
-      </w:pPr>
-      <w:r>
-        <w:rPr>
-          <w:rFonts w:ascii="Courier New" w:hAnsi="Courier New"/>
-          <w:color w:val="24292F"/>
-          <w:sz w:val="18"/>
-        </w:rPr>
-        <w:t>├── commands/</w:t>
-      </w:r>
-    </w:p>
-    <w:p>
-      <w:pPr>
-        <w:shd w:val="clear" w:color="auto" w:fill="F3F4F6"/>
-        <w:spacing w:before="40" w:after="40"/>
-        <w:ind w:left="576"/>
-      </w:pPr>
-      <w:r>
-        <w:rPr>
-          <w:rFonts w:ascii="Courier New" w:hAnsi="Courier New"/>
-          <w:color w:val="24292F"/>
-          <w:sz w:val="18"/>
-        </w:rPr>
-        <w:t>│   ├── prd.md                  ← /</w:t>
-      </w:r>
-      <w:proofErr w:type="spellStart"/>
-      <w:r>
-        <w:rPr>
-          <w:rFonts w:ascii="Courier New" w:hAnsi="Courier New"/>
-          <w:color w:val="24292F"/>
-          <w:sz w:val="18"/>
-        </w:rPr>
-        <w:t>prd</w:t>
-      </w:r>
-      <w:proofErr w:type="spellEnd"/>
-      <w:r>
-        <w:rPr>
-          <w:rFonts w:ascii="Courier New" w:hAnsi="Courier New"/>
-          <w:color w:val="24292F"/>
-          <w:sz w:val="18"/>
-        </w:rPr>
-        <w:t xml:space="preserve"> slash command</w:t>
-      </w:r>
-    </w:p>
-    <w:p>
-      <w:pPr>
-        <w:shd w:val="clear" w:color="auto" w:fill="F3F4F6"/>
-        <w:spacing w:before="40" w:after="40"/>
-        <w:ind w:left="576"/>
-      </w:pPr>
-      <w:r>
-        <w:rPr>
-          <w:rFonts w:ascii="Courier New" w:hAnsi="Courier New"/>
-          <w:color w:val="24292F"/>
-          <w:sz w:val="18"/>
-        </w:rPr>
-        <w:t>│   └── rag.md                  ← /rag document query command</w:t>
-      </w:r>
-    </w:p>
-    <w:p>
-      <w:pPr>
-        <w:shd w:val="clear" w:color="auto" w:fill="F3F4F6"/>
-        <w:spacing w:before="40" w:after="40"/>
-        <w:ind w:left="576"/>
-      </w:pPr>
-      <w:r>
-        <w:rPr>
-          <w:rFonts w:ascii="Courier New" w:hAnsi="Courier New"/>
-          <w:color w:val="24292F"/>
-          <w:sz w:val="18"/>
-        </w:rPr>
-        <w:t>├── skills/</w:t>
-      </w:r>
-    </w:p>
-    <w:p>
-      <w:pPr>
-        <w:shd w:val="clear" w:color="auto" w:fill="F3F4F6"/>
-        <w:spacing w:before="40" w:after="40"/>
-        <w:ind w:left="576"/>
-      </w:pPr>
-      <w:r>
-        <w:rPr>
-          <w:rFonts w:ascii="Courier New" w:hAnsi="Courier New"/>
-          <w:color w:val="24292F"/>
-          <w:sz w:val="18"/>
-        </w:rPr>
-        <w:t>│   └── prd/SKILL.md            ← PRD creation skill</w:t>
-      </w:r>
-    </w:p>
-    <w:p>
-      <w:pPr>
-        <w:shd w:val="clear" w:color="auto" w:fill="F3F4F6"/>
-        <w:spacing w:before="40" w:after="40"/>
-        <w:ind w:left="576"/>
-      </w:pPr>
-      <w:r>
-        <w:rPr>
-          <w:rFonts w:ascii="Courier New" w:hAnsi="Courier New"/>
-          <w:color w:val="24292F"/>
-          <w:sz w:val="18"/>
-        </w:rPr>
-        <w:t>└── plugins/</w:t>
-      </w:r>
-    </w:p>
-    <w:p>
-      <w:pPr>
-        <w:shd w:val="clear" w:color="auto" w:fill="F3F4F6"/>
-        <w:spacing w:before="40" w:after="40"/>
-        <w:ind w:left="576"/>
-      </w:pPr>
-      <w:r>
-        <w:rPr>
-          <w:rFonts w:ascii="Courier New" w:hAnsi="Courier New"/>
-          <w:color w:val="24292F"/>
-          <w:sz w:val="18"/>
-        </w:rPr>
-        <w:t xml:space="preserve">└── hooks-handlers/init-ai.sh     ← </w:t>
-      </w:r>
-      <w:proofErr w:type="spellStart"/>
-      <w:r>
-        <w:rPr>
-          <w:rFonts w:ascii="Courier New" w:hAnsi="Courier New"/>
-          <w:color w:val="24292F"/>
-          <w:sz w:val="18"/>
-        </w:rPr>
-        <w:t>SessionStart</w:t>
-      </w:r>
-      <w:proofErr w:type="spellEnd"/>
-      <w:r>
-        <w:rPr>
-          <w:rFonts w:ascii="Courier New" w:hAnsi="Courier New"/>
-          <w:color w:val="24292F"/>
-          <w:sz w:val="18"/>
-        </w:rPr>
-        <w:t xml:space="preserve"> hook: auto-</w:t>
-      </w:r>
-      <w:proofErr w:type="spellStart"/>
-      <w:r>
-        <w:rPr>
-          <w:rFonts w:ascii="Courier New" w:hAnsi="Courier New"/>
-          <w:color w:val="24292F"/>
-          <w:sz w:val="18"/>
-        </w:rPr>
-        <w:t>init</w:t>
-      </w:r>
-      <w:proofErr w:type="spellEnd"/>
-      <w:r>
-        <w:rPr>
-          <w:rFonts w:ascii="Courier New" w:hAnsi="Courier New"/>
-          <w:color w:val="24292F"/>
-          <w:sz w:val="18"/>
-        </w:rPr>
-        <w:t xml:space="preserve"> .ai/ + tasks sync</w:t>
-      </w:r>
-    </w:p>
-    <w:p>
-      <w:pPr>
-        <w:shd w:val="clear" w:color="auto" w:fill="F3F4F6"/>
-        <w:spacing w:before="40" w:after="40"/>
-        <w:ind w:left="576"/>
-        <w:shd w:val="clear" w:color="auto" w:fill="F3F4F6"/>
-      </w:pPr>
-      <w:r>
-        <w:rPr>
-          <w:rFonts w:ascii="Courier New" w:hAnsi="Courier New"/>
-          <w:color w:val="24292F"/>
-          <w:sz w:val="18"/>
-        </w:rPr>
-      </w:r>
-      <w:proofErr w:type="spellStart"/>
-      <w:r>
-        <w:rPr>
-          <w:rFonts w:ascii="Courier New" w:hAnsi="Courier New"/>
-          <w:color w:val="24292F"/>
-          <w:sz w:val="18"/>
-        </w:rPr>
-      </w:r>
-      <w:proofErr w:type="spellEnd"/>
-      <w:r>
-        <w:rPr>
-          <w:rFonts w:ascii="Courier New" w:hAnsi="Courier New"/>
-          <w:color w:val="24292F"/>
-          <w:sz w:val="18"/>
-        </w:rPr>
-      </w:r>
-      <w:proofErr w:type="spellStart"/>
-      <w:r>
-        <w:rPr>
-          <w:rFonts w:ascii="Courier New" w:hAnsi="Courier New"/>
-          <w:color w:val="24292F"/>
-          <w:sz w:val="18"/>
-        </w:rPr>
-      </w:r>
-      <w:proofErr w:type="spellEnd"/>
-      <w:r>
-        <w:rPr>
-          <w:rFonts w:ascii="Courier New" w:hAnsi="Courier New"/>
-          <w:color w:val="24292F"/>
-          <w:sz w:val="18"/>
-        </w:rPr>
-      </w:r>
-      <w:r>
-        <w:rPr>
-          <w:rFonts w:ascii="Courier New" w:hAnsi="Courier New"/>
-          <w:color w:val="24292F"/>
-          <w:sz w:val="18"/>
-        </w:rPr>
-        <w:t>└── example-ai/                    ← Annotated .ai/ templates to copy into any repo</w:t>
-      </w:r>
-    </w:p>
-    <w:p>
-      <w:pPr>
-        <w:shd w:val="clear" w:color="auto" w:fill="F3F4F6"/>
-        <w:spacing w:before="40" w:after="40"/>
-        <w:ind w:left="576"/>
-      </w:pPr>
-      <w:r>
-        <w:rPr>
-          <w:rFonts w:ascii="Courier New" w:hAnsi="Courier New"/>
-          <w:color w:val="24292F"/>
-          <w:sz w:val="18"/>
-        </w:rPr>
-        <w:t xml:space="preserve">    ├── local/user-skills/      ← ADR skill (local plugin)</w:t>
-      </w:r>
-    </w:p>
-    <w:p>
-      <w:pPr>
-        <w:shd w:val="clear" w:color="auto" w:fill="F3F4F6"/>
-        <w:spacing w:before="40" w:after="40"/>
-        <w:ind w:left="576"/>
-      </w:pPr>
-      <w:r>
-        <w:rPr>
-          <w:rFonts w:ascii="Courier New" w:hAnsi="Courier New"/>
-          <w:color w:val="24292F"/>
-          <w:sz w:val="18"/>
-        </w:rPr>
-        <w:t xml:space="preserve">    ├── </w:t>
-      </w:r>
-      <w:proofErr w:type="spellStart"/>
-      <w:proofErr w:type="gramStart"/>
-      <w:r>
-        <w:rPr>
-          <w:rFonts w:ascii="Courier New" w:hAnsi="Courier New"/>
-          <w:color w:val="24292F"/>
-          <w:sz w:val="18"/>
-        </w:rPr>
-        <w:t>blocklist.json</w:t>
-      </w:r>
-      <w:proofErr w:type="spellEnd"/>
-      <w:proofErr w:type="gramEnd"/>
-    </w:p>
-    <w:p>
-      <w:pPr>
-        <w:shd w:val="clear" w:color="auto" w:fill="F3F4F6"/>
-        <w:spacing w:before="40" w:after="40"/>
-        <w:ind w:left="576"/>
-      </w:pPr>
-      <w:r>
-        <w:rPr>
-          <w:rFonts w:ascii="Courier New" w:hAnsi="Courier New"/>
-          <w:color w:val="24292F"/>
-          <w:sz w:val="18"/>
-        </w:rPr>
-        <w:t xml:space="preserve">    └── </w:t>
-      </w:r>
-      <w:proofErr w:type="spellStart"/>
-      <w:r>
-        <w:rPr>
-          <w:rFonts w:ascii="Courier New" w:hAnsi="Courier New"/>
-          <w:color w:val="24292F"/>
-          <w:sz w:val="18"/>
-        </w:rPr>
-        <w:t>known_</w:t>
-      </w:r>
-      <w:proofErr w:type="gramStart"/>
-      <w:r>
-        <w:rPr>
-          <w:rFonts w:ascii="Courier New" w:hAnsi="Courier New"/>
-          <w:color w:val="24292F"/>
-          <w:sz w:val="18"/>
-        </w:rPr>
-        <w:t>marketplaces.json</w:t>
-      </w:r>
-      <w:proofErr w:type="spellEnd"/>
-      <w:proofErr w:type="gramEnd"/>
+      <w:r>
+        <w:t xml:space="preserve">.claude/</w:t>
+      </w:r>
+    </w:p>
+    <w:p>
+      <w:r>
+        <w:t xml:space="preserve">├── CLAUDE.md                        ← Global instructions (loaded every session)</w:t>
+      </w:r>
+    </w:p>
+    <w:p>
+      <w:r>
+        <w:t xml:space="preserve">├── settings.json                    ← Permissions, plugins, output style</w:t>
+      </w:r>
+    </w:p>
+    <w:p>
+      <w:r>
+        <w:t xml:space="preserve">├── policy-limits.json               ← Security: disables remote control</w:t>
+      </w:r>
+    </w:p>
+    <w:p>
+      <w:r>
+        <w:t xml:space="preserve">├── .gitignore                       ← Excludes ephemeral files from git</w:t>
+      </w:r>
+    </w:p>
+    <w:p>
+      <w:r>
+        <w:t xml:space="preserve">├── README.md                        ← Quick reference</w:t>
+      </w:r>
+    </w:p>
+    <w:p>
+      <w:r>
+        <w:t xml:space="preserve">├── commands/</w:t>
+      </w:r>
+    </w:p>
+    <w:p>
+      <w:r>
+        <w:t xml:space="preserve">│   ├── prd.md                   ← /prd slash command</w:t>
+      </w:r>
+    </w:p>
+    <w:p>
+      <w:r>
+        <w:t xml:space="preserve">│   └── rag.md                   ← /rag document query command</w:t>
+      </w:r>
+    </w:p>
+    <w:p>
+      <w:r>
+        <w:t xml:space="preserve">├── skills/</w:t>
+      </w:r>
+    </w:p>
+    <w:p>
+      <w:r>
+        <w:t xml:space="preserve">│   └── prd/SKILL.md             ← PRD creation skill</w:t>
+      </w:r>
+    </w:p>
+    <w:p>
+      <w:r>
+        <w:t xml:space="preserve">├── plugins/</w:t>
+      </w:r>
+    </w:p>
+    <w:p>
+      <w:r>
+        <w:t xml:space="preserve">│   ├── blocklist.json</w:t>
+      </w:r>
+    </w:p>
+    <w:p>
+      <w:r>
+        <w:t xml:space="preserve">│   ├── known_marketplaces.json</w:t>
+      </w:r>
+    </w:p>
+    <w:p>
+      <w:r>
+        <w:t xml:space="preserve">│   └── local/user-skills/       ← Local plugin bundle</w:t>
+      </w:r>
+    </w:p>
+    <w:p>
+      <w:r>
+        <w:t xml:space="preserve">│       ├── skills/adr/SKILL.md      ← ADR skill</w:t>
+      </w:r>
+    </w:p>
+    <w:p>
+      <w:r>
+        <w:t xml:space="preserve">│       └── skills/html-docs/SKILL.md ← HTML docs generator skill</w:t>
+      </w:r>
+    </w:p>
+    <w:p>
+      <w:r>
+        <w:t xml:space="preserve">├── hooks-handlers/</w:t>
+      </w:r>
+    </w:p>
+    <w:p>
+      <w:r>
+        <w:t xml:space="preserve">│   └── init-ai.sh               ← SessionStart hook: auto-init .ai/ + tasks sync</w:t>
+      </w:r>
+    </w:p>
+    <w:p>
+      <w:r>
+        <w:t xml:space="preserve">├── projects/template/memory/</w:t>
+      </w:r>
+    </w:p>
+    <w:p>
+      <w:r>
+        <w:t xml:space="preserve">│   ├── MEMORY.md                ← Memory index (auto-managed)</w:t>
+      </w:r>
+    </w:p>
+    <w:p>
+      <w:r>
+        <w:t xml:space="preserve">│   └── user_profile.md          ← Your role, stack, preferences</w:t>
+      </w:r>
+    </w:p>
+    <w:p>
+      <w:r>
+        <w:t xml:space="preserve">└── example-ai/                      ← Annotated .ai/ templates to copy into any repo</w:t>
+      </w:r>
     </w:p>
     <w:p/>
     <w:p>

</xml_diff>

<commit_message>
Consolidate PRD skill into local plugin bundle
- Moved skills/prd/ into plugins/local/user-skills/skills/prd/
- Removed standalone skills/ directory
- Updated file tree in Word doc and README

Co-Authored-By: Claude Opus 4.6 (1M context) <noreply@anthropic.com>
</commit_message>
<xml_diff>
--- a/ON24 Claude Code Onboarding Guide.docx
+++ b/ON24 Claude Code Onboarding Guide.docx
@@ -498,16 +498,6 @@
     </w:p>
     <w:p>
       <w:r>
-        <w:t xml:space="preserve">├── skills/</w:t>
-      </w:r>
-    </w:p>
-    <w:p>
-      <w:r>
-        <w:t xml:space="preserve">│   └── prd/SKILL.md             ← PRD creation skill</w:t>
-      </w:r>
-    </w:p>
-    <w:p>
-      <w:r>
         <w:t xml:space="preserve">├── plugins/</w:t>
       </w:r>
     </w:p>
@@ -523,12 +513,17 @@
     </w:p>
     <w:p>
       <w:r>
-        <w:t xml:space="preserve">│   └── local/user-skills/       ← Local plugin bundle</w:t>
-      </w:r>
-    </w:p>
-    <w:p>
-      <w:r>
-        <w:t xml:space="preserve">│       ├── skills/adr/SKILL.md      ← ADR skill</w:t>
+        <w:t>│   └── local/user-skills/       ← Local plugin bundle (PRD, ADR, html-docs)</w:t>
+      </w:r>
+    </w:p>
+    <w:p>
+      <w:r>
+        <w:t>│       ├── skills/prd/SKILL.md       ← PRD creation skill</w:t>
+      </w:r>
+    </w:p>
+    <w:p>
+      <w:r>
+        <w:t>│       ├── skills/adr/SKILL.md       ← ADR skill</w:t>
       </w:r>
     </w:p>
     <w:p>

</xml_diff>

<commit_message>
Add Windows symlink troubleshooting entry to onboarding doc
Plugin scripts/data dirs can appear as text files on Windows
when git symlinks don't resolve. Documents the manual fix.

Co-Authored-By: Claude Opus 4.6 (1M context) <noreply@anthropic.com>
</commit_message>
<xml_diff>
--- a/ON24 Claude Code Onboarding Guide.docx
+++ b/ON24 Claude Code Onboarding Guide.docx
@@ -3821,6 +3821,17 @@
       <w:proofErr w:type="spellEnd"/>
       <w:r>
         <w:t xml:space="preserve"> hook entry. The hook requires python3 to be on PATH for JSON escaping. Test manually: bash ~/.claude/hooks-handlers/init-ai.sh</w:t>
+      </w:r>
+    </w:p>
+    <w:p/>
+    <w:p>
+      <w:r>
+        <w:t xml:space="preserve">Problem: Plugin scripts/data directories appear as text files on Windows</w:t>
+      </w:r>
+    </w:p>
+    <w:p>
+      <w:r>
+        <w:t xml:space="preserve">Solution: Some plugins use git symlinks for scripts/ and data/ directories. On Windows, these become plain text files containing the symlink target path instead of actual directories. To fix: navigate to the broken skill directory (e.g. ~/.claude/plugins/cache/&lt;plugin&gt;/&lt;version&gt;/.claude/skills/&lt;skill&gt;/), delete the text files named scripts and data, then copy the real directories from the plugin’s src/ folder: rm scripts data &amp;&amp; cp -r ../../../src/&lt;skill&gt;/scripts . &amp;&amp; cp -r ../../../src/&lt;skill&gt;/data . — This fix persists until the plugin updates, at which point you may need to repeat it.</w:t>
       </w:r>
     </w:p>
     <w:p/>

</xml_diff>